<commit_message>
doc: removing references to formula cloud
</commit_message>
<xml_diff>
--- a/assets/manual/Formula-User-Manual.docx
+++ b/assets/manual/Formula-User-Manual.docx
@@ -1,6 +1,6 @@
 
 <file path=word/document.xml><?xml version="1.0" encoding="utf-8"?>
-<w:document xmlns:wpc="http://schemas.microsoft.com/office/word/2010/wordprocessingCanvas" xmlns:cx="http://schemas.microsoft.com/office/drawing/2014/chartex" xmlns:cx1="http://schemas.microsoft.com/office/drawing/2015/9/8/chartex" xmlns:cx2="http://schemas.microsoft.com/office/drawing/2015/10/21/chartex" xmlns:cx3="http://schemas.microsoft.com/office/drawing/2016/5/9/chartex" xmlns:cx4="http://schemas.microsoft.com/office/drawing/2016/5/10/chartex" xmlns:cx5="http://schemas.microsoft.com/office/drawing/2016/5/11/chartex" xmlns:cx6="http://schemas.microsoft.com/office/drawing/2016/5/12/chartex" xmlns:cx7="http://schemas.microsoft.com/office/drawing/2016/5/13/chartex" xmlns:cx8="http://schemas.microsoft.com/office/drawing/2016/5/14/chartex" xmlns:mc="http://schemas.openxmlformats.org/markup-compatibility/2006" xmlns:aink="http://schemas.microsoft.com/office/drawing/2016/ink" xmlns:am3d="http://schemas.microsoft.com/office/drawing/2017/model3d" xmlns:o="urn:schemas-microsoft-com:office:office" xmlns:oel="http://schemas.microsoft.com/office/2019/extlst" xmlns:r="http://schemas.openxmlformats.org/officeDocument/2006/relationships" xmlns:m="http://schemas.openxmlformats.org/officeDocument/2006/math" xmlns:v="urn:schemas-microsoft-com:vml" xmlns:wp14="http://schemas.microsoft.com/office/word/2010/wordprocessingDrawing" xmlns:wp="http://schemas.openxmlformats.org/drawingml/2006/wordprocessingDrawing" xmlns:w10="urn:schemas-microsoft-com:office:word" xmlns:w="http://schemas.openxmlformats.org/wordprocessingml/2006/main" xmlns:w14="http://schemas.microsoft.com/office/word/2010/wordml" xmlns:w15="http://schemas.microsoft.com/office/word/2012/wordml" xmlns:w16cex="http://schemas.microsoft.com/office/word/2018/wordml/cex" xmlns:w16cid="http://schemas.microsoft.com/office/word/2016/wordml/cid" xmlns:w16="http://schemas.microsoft.com/office/word/2018/wordml" xmlns:w16sdtdh="http://schemas.microsoft.com/office/word/2020/wordml/sdtdatahash" xmlns:w16se="http://schemas.microsoft.com/office/word/2015/wordml/symex" xmlns:wpg="http://schemas.microsoft.com/office/word/2010/wordprocessingGroup" xmlns:wpi="http://schemas.microsoft.com/office/word/2010/wordprocessingInk" xmlns:wne="http://schemas.microsoft.com/office/word/2006/wordml" xmlns:wps="http://schemas.microsoft.com/office/word/2010/wordprocessingShape" mc:Ignorable="w14 w15 w16se w16cid w16 w16cex w16sdtdh wp14">
+<w:document xmlns:wpc="http://schemas.microsoft.com/office/word/2010/wordprocessingCanvas" xmlns:cx="http://schemas.microsoft.com/office/drawing/2014/chartex" xmlns:cx1="http://schemas.microsoft.com/office/drawing/2015/9/8/chartex" xmlns:cx2="http://schemas.microsoft.com/office/drawing/2015/10/21/chartex" xmlns:cx3="http://schemas.microsoft.com/office/drawing/2016/5/9/chartex" xmlns:cx4="http://schemas.microsoft.com/office/drawing/2016/5/10/chartex" xmlns:cx5="http://schemas.microsoft.com/office/drawing/2016/5/11/chartex" xmlns:cx6="http://schemas.microsoft.com/office/drawing/2016/5/12/chartex" xmlns:cx7="http://schemas.microsoft.com/office/drawing/2016/5/13/chartex" xmlns:cx8="http://schemas.microsoft.com/office/drawing/2016/5/14/chartex" xmlns:mc="http://schemas.openxmlformats.org/markup-compatibility/2006" xmlns:aink="http://schemas.microsoft.com/office/drawing/2016/ink" xmlns:am3d="http://schemas.microsoft.com/office/drawing/2017/model3d" xmlns:o="urn:schemas-microsoft-com:office:office" xmlns:oel="http://schemas.microsoft.com/office/2019/extlst" xmlns:r="http://schemas.openxmlformats.org/officeDocument/2006/relationships" xmlns:m="http://schemas.openxmlformats.org/officeDocument/2006/math" xmlns:v="urn:schemas-microsoft-com:vml" xmlns:wp14="http://schemas.microsoft.com/office/word/2010/wordprocessingDrawing" xmlns:wp="http://schemas.openxmlformats.org/drawingml/2006/wordprocessingDrawing" xmlns:w10="urn:schemas-microsoft-com:office:word" xmlns:w="http://schemas.openxmlformats.org/wordprocessingml/2006/main" xmlns:w14="http://schemas.microsoft.com/office/word/2010/wordml" xmlns:w15="http://schemas.microsoft.com/office/word/2012/wordml" xmlns:w16cex="http://schemas.microsoft.com/office/word/2018/wordml/cex" xmlns:w16cid="http://schemas.microsoft.com/office/word/2016/wordml/cid" xmlns:w16="http://schemas.microsoft.com/office/word/2018/wordml" xmlns:w16du="http://schemas.microsoft.com/office/word/2023/wordml/word16du" xmlns:w16sdtdh="http://schemas.microsoft.com/office/word/2020/wordml/sdtdatahash" xmlns:w16se="http://schemas.microsoft.com/office/word/2015/wordml/symex" xmlns:wpg="http://schemas.microsoft.com/office/word/2010/wordprocessingGroup" xmlns:wpi="http://schemas.microsoft.com/office/word/2010/wordprocessingInk" xmlns:wne="http://schemas.microsoft.com/office/word/2006/wordml" xmlns:wps="http://schemas.microsoft.com/office/word/2010/wordprocessingShape" mc:Ignorable="w14 w15 w16se w16cid w16 w16cex w16sdtdh w16du wp14">
   <w:body>
     <w:p>
       <w:pPr>
@@ -223,7 +223,6 @@
           <w:docPartUnique/>
         </w:docPartObj>
       </w:sdtPr>
-      <w:sdtEndPr/>
       <w:sdtContent>
         <w:p>
           <w:pPr>
@@ -247,9 +246,9 @@
             <w:rPr>
               <w:rFonts w:asciiTheme="minorHAnsi" w:eastAsiaTheme="minorEastAsia" w:hAnsiTheme="minorHAnsi"/>
               <w:noProof/>
-              <w:sz w:val="22"/>
-              <w:szCs w:val="22"/>
+              <w:kern w:val="2"/>
               <w:lang w:val="fr-FR" w:eastAsia="fr-FR"/>
+              <w14:ligatures w14:val="standardContextual"/>
             </w:rPr>
           </w:pPr>
           <w:r>
@@ -261,7 +260,7 @@
           <w:r>
             <w:fldChar w:fldCharType="separate"/>
           </w:r>
-          <w:hyperlink w:anchor="_Toc107158134" w:history="1">
+          <w:hyperlink w:anchor="_Toc172493541" w:history="1">
             <w:r>
               <w:rPr>
                 <w:rStyle w:val="Lienhypertexte"/>
@@ -288,7 +287,7 @@
                 <w:noProof/>
                 <w:webHidden/>
               </w:rPr>
-              <w:instrText xml:space="preserve"> PAGEREF _Toc107158134 \h </w:instrText>
+              <w:instrText xml:space="preserve"> PAGEREF _Toc172493541 \h </w:instrText>
             </w:r>
             <w:r>
               <w:rPr>
@@ -328,12 +327,12 @@
             <w:rPr>
               <w:rFonts w:asciiTheme="minorHAnsi" w:eastAsiaTheme="minorEastAsia" w:hAnsiTheme="minorHAnsi"/>
               <w:noProof/>
-              <w:sz w:val="22"/>
-              <w:szCs w:val="22"/>
+              <w:kern w:val="2"/>
               <w:lang w:val="fr-FR" w:eastAsia="fr-FR"/>
+              <w14:ligatures w14:val="standardContextual"/>
             </w:rPr>
           </w:pPr>
-          <w:hyperlink w:anchor="_Toc107158135" w:history="1">
+          <w:hyperlink w:anchor="_Toc172493542" w:history="1">
             <w:r>
               <w:rPr>
                 <w:rStyle w:val="Lienhypertexte"/>
@@ -360,7 +359,7 @@
                 <w:noProof/>
                 <w:webHidden/>
               </w:rPr>
-              <w:instrText xml:space="preserve"> PAGEREF _Toc107158135 \h </w:instrText>
+              <w:instrText xml:space="preserve"> PAGEREF _Toc172493542 \h </w:instrText>
             </w:r>
             <w:r>
               <w:rPr>
@@ -400,12 +399,12 @@
             <w:rPr>
               <w:rFonts w:asciiTheme="minorHAnsi" w:eastAsiaTheme="minorEastAsia" w:hAnsiTheme="minorHAnsi"/>
               <w:noProof/>
-              <w:sz w:val="22"/>
-              <w:szCs w:val="22"/>
+              <w:kern w:val="2"/>
               <w:lang w:val="fr-FR" w:eastAsia="fr-FR"/>
+              <w14:ligatures w14:val="standardContextual"/>
             </w:rPr>
           </w:pPr>
-          <w:hyperlink w:anchor="_Toc107158136" w:history="1">
+          <w:hyperlink w:anchor="_Toc172493543" w:history="1">
             <w:r>
               <w:rPr>
                 <w:rStyle w:val="Lienhypertexte"/>
@@ -432,7 +431,7 @@
                 <w:noProof/>
                 <w:webHidden/>
               </w:rPr>
-              <w:instrText xml:space="preserve"> PAGEREF _Toc107158136 \h </w:instrText>
+              <w:instrText xml:space="preserve"> PAGEREF _Toc172493543 \h </w:instrText>
             </w:r>
             <w:r>
               <w:rPr>
@@ -472,12 +471,12 @@
             <w:rPr>
               <w:rFonts w:asciiTheme="minorHAnsi" w:eastAsiaTheme="minorEastAsia" w:hAnsiTheme="minorHAnsi"/>
               <w:noProof/>
-              <w:sz w:val="22"/>
-              <w:szCs w:val="22"/>
+              <w:kern w:val="2"/>
               <w:lang w:val="fr-FR" w:eastAsia="fr-FR"/>
+              <w14:ligatures w14:val="standardContextual"/>
             </w:rPr>
           </w:pPr>
-          <w:hyperlink w:anchor="_Toc107158137" w:history="1">
+          <w:hyperlink w:anchor="_Toc172493544" w:history="1">
             <w:r>
               <w:rPr>
                 <w:rStyle w:val="Lienhypertexte"/>
@@ -504,7 +503,7 @@
                 <w:noProof/>
                 <w:webHidden/>
               </w:rPr>
-              <w:instrText xml:space="preserve"> PAGEREF _Toc107158137 \h </w:instrText>
+              <w:instrText xml:space="preserve"> PAGEREF _Toc172493544 \h </w:instrText>
             </w:r>
             <w:r>
               <w:rPr>
@@ -544,12 +543,12 @@
             <w:rPr>
               <w:rFonts w:asciiTheme="minorHAnsi" w:eastAsiaTheme="minorEastAsia" w:hAnsiTheme="minorHAnsi"/>
               <w:noProof/>
-              <w:sz w:val="22"/>
-              <w:szCs w:val="22"/>
+              <w:kern w:val="2"/>
               <w:lang w:val="fr-FR" w:eastAsia="fr-FR"/>
+              <w14:ligatures w14:val="standardContextual"/>
             </w:rPr>
           </w:pPr>
-          <w:hyperlink w:anchor="_Toc107158138" w:history="1">
+          <w:hyperlink w:anchor="_Toc172493545" w:history="1">
             <w:r>
               <w:rPr>
                 <w:rStyle w:val="Lienhypertexte"/>
@@ -576,7 +575,7 @@
                 <w:noProof/>
                 <w:webHidden/>
               </w:rPr>
-              <w:instrText xml:space="preserve"> PAGEREF _Toc107158138 \h </w:instrText>
+              <w:instrText xml:space="preserve"> PAGEREF _Toc172493545 \h </w:instrText>
             </w:r>
             <w:r>
               <w:rPr>
@@ -616,12 +615,12 @@
             <w:rPr>
               <w:rFonts w:asciiTheme="minorHAnsi" w:eastAsiaTheme="minorEastAsia" w:hAnsiTheme="minorHAnsi"/>
               <w:noProof/>
-              <w:sz w:val="22"/>
-              <w:szCs w:val="22"/>
+              <w:kern w:val="2"/>
               <w:lang w:val="fr-FR" w:eastAsia="fr-FR"/>
+              <w14:ligatures w14:val="standardContextual"/>
             </w:rPr>
           </w:pPr>
-          <w:hyperlink w:anchor="_Toc107158139" w:history="1">
+          <w:hyperlink w:anchor="_Toc172493546" w:history="1">
             <w:r>
               <w:rPr>
                 <w:rStyle w:val="Lienhypertexte"/>
@@ -648,7 +647,7 @@
                 <w:noProof/>
                 <w:webHidden/>
               </w:rPr>
-              <w:instrText xml:space="preserve"> PAGEREF _Toc107158139 \h </w:instrText>
+              <w:instrText xml:space="preserve"> PAGEREF _Toc172493546 \h </w:instrText>
             </w:r>
             <w:r>
               <w:rPr>
@@ -688,12 +687,12 @@
             <w:rPr>
               <w:rFonts w:asciiTheme="minorHAnsi" w:eastAsiaTheme="minorEastAsia" w:hAnsiTheme="minorHAnsi"/>
               <w:noProof/>
-              <w:sz w:val="22"/>
-              <w:szCs w:val="22"/>
+              <w:kern w:val="2"/>
               <w:lang w:val="fr-FR" w:eastAsia="fr-FR"/>
+              <w14:ligatures w14:val="standardContextual"/>
             </w:rPr>
           </w:pPr>
-          <w:hyperlink w:anchor="_Toc107158140" w:history="1">
+          <w:hyperlink w:anchor="_Toc172493547" w:history="1">
             <w:r>
               <w:rPr>
                 <w:rStyle w:val="Lienhypertexte"/>
@@ -720,7 +719,7 @@
                 <w:noProof/>
                 <w:webHidden/>
               </w:rPr>
-              <w:instrText xml:space="preserve"> PAGEREF _Toc107158140 \h </w:instrText>
+              <w:instrText xml:space="preserve"> PAGEREF _Toc172493547 \h </w:instrText>
             </w:r>
             <w:r>
               <w:rPr>
@@ -760,12 +759,12 @@
             <w:rPr>
               <w:rFonts w:asciiTheme="minorHAnsi" w:eastAsiaTheme="minorEastAsia" w:hAnsiTheme="minorHAnsi"/>
               <w:noProof/>
-              <w:sz w:val="22"/>
-              <w:szCs w:val="22"/>
+              <w:kern w:val="2"/>
               <w:lang w:val="fr-FR" w:eastAsia="fr-FR"/>
+              <w14:ligatures w14:val="standardContextual"/>
             </w:rPr>
           </w:pPr>
-          <w:hyperlink w:anchor="_Toc107158141" w:history="1">
+          <w:hyperlink w:anchor="_Toc172493548" w:history="1">
             <w:r>
               <w:rPr>
                 <w:rStyle w:val="Lienhypertexte"/>
@@ -792,7 +791,7 @@
                 <w:noProof/>
                 <w:webHidden/>
               </w:rPr>
-              <w:instrText xml:space="preserve"> PAGEREF _Toc107158141 \h </w:instrText>
+              <w:instrText xml:space="preserve"> PAGEREF _Toc172493548 \h </w:instrText>
             </w:r>
             <w:r>
               <w:rPr>
@@ -832,12 +831,12 @@
             <w:rPr>
               <w:rFonts w:asciiTheme="minorHAnsi" w:eastAsiaTheme="minorEastAsia" w:hAnsiTheme="minorHAnsi"/>
               <w:noProof/>
-              <w:sz w:val="22"/>
-              <w:szCs w:val="22"/>
+              <w:kern w:val="2"/>
               <w:lang w:val="fr-FR" w:eastAsia="fr-FR"/>
+              <w14:ligatures w14:val="standardContextual"/>
             </w:rPr>
           </w:pPr>
-          <w:hyperlink w:anchor="_Toc107158142" w:history="1">
+          <w:hyperlink w:anchor="_Toc172493549" w:history="1">
             <w:r>
               <w:rPr>
                 <w:rStyle w:val="Lienhypertexte"/>
@@ -864,7 +863,7 @@
                 <w:noProof/>
                 <w:webHidden/>
               </w:rPr>
-              <w:instrText xml:space="preserve"> PAGEREF _Toc107158142 \h </w:instrText>
+              <w:instrText xml:space="preserve"> PAGEREF _Toc172493549 \h </w:instrText>
             </w:r>
             <w:r>
               <w:rPr>
@@ -904,12 +903,12 @@
             <w:rPr>
               <w:rFonts w:asciiTheme="minorHAnsi" w:eastAsiaTheme="minorEastAsia" w:hAnsiTheme="minorHAnsi"/>
               <w:noProof/>
-              <w:sz w:val="22"/>
-              <w:szCs w:val="22"/>
+              <w:kern w:val="2"/>
               <w:lang w:val="fr-FR" w:eastAsia="fr-FR"/>
+              <w14:ligatures w14:val="standardContextual"/>
             </w:rPr>
           </w:pPr>
-          <w:hyperlink w:anchor="_Toc107158143" w:history="1">
+          <w:hyperlink w:anchor="_Toc172493550" w:history="1">
             <w:r>
               <w:rPr>
                 <w:rStyle w:val="Lienhypertexte"/>
@@ -936,7 +935,7 @@
                 <w:noProof/>
                 <w:webHidden/>
               </w:rPr>
-              <w:instrText xml:space="preserve"> PAGEREF _Toc107158143 \h </w:instrText>
+              <w:instrText xml:space="preserve"> PAGEREF _Toc172493550 \h </w:instrText>
             </w:r>
             <w:r>
               <w:rPr>
@@ -976,12 +975,12 @@
             <w:rPr>
               <w:rFonts w:asciiTheme="minorHAnsi" w:eastAsiaTheme="minorEastAsia" w:hAnsiTheme="minorHAnsi"/>
               <w:noProof/>
-              <w:sz w:val="22"/>
-              <w:szCs w:val="22"/>
+              <w:kern w:val="2"/>
               <w:lang w:val="fr-FR" w:eastAsia="fr-FR"/>
+              <w14:ligatures w14:val="standardContextual"/>
             </w:rPr>
           </w:pPr>
-          <w:hyperlink w:anchor="_Toc107158144" w:history="1">
+          <w:hyperlink w:anchor="_Toc172493551" w:history="1">
             <w:r>
               <w:rPr>
                 <w:rStyle w:val="Lienhypertexte"/>
@@ -1008,7 +1007,7 @@
                 <w:noProof/>
                 <w:webHidden/>
               </w:rPr>
-              <w:instrText xml:space="preserve"> PAGEREF _Toc107158144 \h </w:instrText>
+              <w:instrText xml:space="preserve"> PAGEREF _Toc172493551 \h </w:instrText>
             </w:r>
             <w:r>
               <w:rPr>
@@ -1048,12 +1047,12 @@
             <w:rPr>
               <w:rFonts w:asciiTheme="minorHAnsi" w:eastAsiaTheme="minorEastAsia" w:hAnsiTheme="minorHAnsi"/>
               <w:noProof/>
-              <w:sz w:val="22"/>
-              <w:szCs w:val="22"/>
+              <w:kern w:val="2"/>
               <w:lang w:val="fr-FR" w:eastAsia="fr-FR"/>
+              <w14:ligatures w14:val="standardContextual"/>
             </w:rPr>
           </w:pPr>
-          <w:hyperlink w:anchor="_Toc107158145" w:history="1">
+          <w:hyperlink w:anchor="_Toc172493552" w:history="1">
             <w:r>
               <w:rPr>
                 <w:rStyle w:val="Lienhypertexte"/>
@@ -1080,7 +1079,7 @@
                 <w:noProof/>
                 <w:webHidden/>
               </w:rPr>
-              <w:instrText xml:space="preserve"> PAGEREF _Toc107158145 \h </w:instrText>
+              <w:instrText xml:space="preserve"> PAGEREF _Toc172493552 \h </w:instrText>
             </w:r>
             <w:r>
               <w:rPr>
@@ -1100,7 +1099,7 @@
                 <w:noProof/>
                 <w:webHidden/>
               </w:rPr>
-              <w:t>9</w:t>
+              <w:t>8</w:t>
             </w:r>
             <w:r>
               <w:rPr>
@@ -1120,18 +1119,18 @@
             <w:rPr>
               <w:rFonts w:asciiTheme="minorHAnsi" w:eastAsiaTheme="minorEastAsia" w:hAnsiTheme="minorHAnsi"/>
               <w:noProof/>
-              <w:sz w:val="22"/>
-              <w:szCs w:val="22"/>
+              <w:kern w:val="2"/>
               <w:lang w:val="fr-FR" w:eastAsia="fr-FR"/>
+              <w14:ligatures w14:val="standardContextual"/>
             </w:rPr>
           </w:pPr>
-          <w:hyperlink w:anchor="_Toc107158146" w:history="1">
+          <w:hyperlink w:anchor="_Toc172493553" w:history="1">
             <w:r>
               <w:rPr>
                 <w:rStyle w:val="Lienhypertexte"/>
                 <w:noProof/>
               </w:rPr>
-              <w:t>Formula cloud</w:t>
+              <w:t>All Formulas</w:t>
             </w:r>
             <w:r>
               <w:rPr>
@@ -1152,7 +1151,7 @@
                 <w:noProof/>
                 <w:webHidden/>
               </w:rPr>
-              <w:instrText xml:space="preserve"> PAGEREF _Toc107158146 \h </w:instrText>
+              <w:instrText xml:space="preserve"> PAGEREF _Toc172493553 \h </w:instrText>
             </w:r>
             <w:r>
               <w:rPr>
@@ -1172,7 +1171,7 @@
                 <w:noProof/>
                 <w:webHidden/>
               </w:rPr>
-              <w:t>10</w:t>
+              <w:t>9</w:t>
             </w:r>
             <w:r>
               <w:rPr>
@@ -1192,12 +1191,12 @@
             <w:rPr>
               <w:rFonts w:asciiTheme="minorHAnsi" w:eastAsiaTheme="minorEastAsia" w:hAnsiTheme="minorHAnsi"/>
               <w:noProof/>
-              <w:sz w:val="22"/>
-              <w:szCs w:val="22"/>
+              <w:kern w:val="2"/>
               <w:lang w:val="fr-FR" w:eastAsia="fr-FR"/>
+              <w14:ligatures w14:val="standardContextual"/>
             </w:rPr>
           </w:pPr>
-          <w:hyperlink w:anchor="_Toc107158147" w:history="1">
+          <w:hyperlink w:anchor="_Toc172493554" w:history="1">
             <w:r>
               <w:rPr>
                 <w:rStyle w:val="Lienhypertexte"/>
@@ -1224,7 +1223,7 @@
                 <w:noProof/>
                 <w:webHidden/>
               </w:rPr>
-              <w:instrText xml:space="preserve"> PAGEREF _Toc107158147 \h </w:instrText>
+              <w:instrText xml:space="preserve"> PAGEREF _Toc172493554 \h </w:instrText>
             </w:r>
             <w:r>
               <w:rPr>
@@ -1244,7 +1243,7 @@
                 <w:noProof/>
                 <w:webHidden/>
               </w:rPr>
-              <w:t>11</w:t>
+              <w:t>9</w:t>
             </w:r>
             <w:r>
               <w:rPr>
@@ -1264,12 +1263,12 @@
             <w:rPr>
               <w:rFonts w:asciiTheme="minorHAnsi" w:eastAsiaTheme="minorEastAsia" w:hAnsiTheme="minorHAnsi"/>
               <w:noProof/>
-              <w:sz w:val="22"/>
-              <w:szCs w:val="22"/>
+              <w:kern w:val="2"/>
               <w:lang w:val="fr-FR" w:eastAsia="fr-FR"/>
+              <w14:ligatures w14:val="standardContextual"/>
             </w:rPr>
           </w:pPr>
-          <w:hyperlink w:anchor="_Toc107158148" w:history="1">
+          <w:hyperlink w:anchor="_Toc172493555" w:history="1">
             <w:r>
               <w:rPr>
                 <w:rStyle w:val="Lienhypertexte"/>
@@ -1296,7 +1295,7 @@
                 <w:noProof/>
                 <w:webHidden/>
               </w:rPr>
-              <w:instrText xml:space="preserve"> PAGEREF _Toc107158148 \h </w:instrText>
+              <w:instrText xml:space="preserve"> PAGEREF _Toc172493555 \h </w:instrText>
             </w:r>
             <w:r>
               <w:rPr>
@@ -1316,7 +1315,7 @@
                 <w:noProof/>
                 <w:webHidden/>
               </w:rPr>
-              <w:t>12</w:t>
+              <w:t>10</w:t>
             </w:r>
             <w:r>
               <w:rPr>
@@ -1336,12 +1335,12 @@
             <w:rPr>
               <w:rFonts w:asciiTheme="minorHAnsi" w:eastAsiaTheme="minorEastAsia" w:hAnsiTheme="minorHAnsi"/>
               <w:noProof/>
-              <w:sz w:val="22"/>
-              <w:szCs w:val="22"/>
+              <w:kern w:val="2"/>
               <w:lang w:val="fr-FR" w:eastAsia="fr-FR"/>
+              <w14:ligatures w14:val="standardContextual"/>
             </w:rPr>
           </w:pPr>
-          <w:hyperlink w:anchor="_Toc107158149" w:history="1">
+          <w:hyperlink w:anchor="_Toc172493556" w:history="1">
             <w:r>
               <w:rPr>
                 <w:rStyle w:val="Lienhypertexte"/>
@@ -1368,7 +1367,7 @@
                 <w:noProof/>
                 <w:webHidden/>
               </w:rPr>
-              <w:instrText xml:space="preserve"> PAGEREF _Toc107158149 \h </w:instrText>
+              <w:instrText xml:space="preserve"> PAGEREF _Toc172493556 \h </w:instrText>
             </w:r>
             <w:r>
               <w:rPr>
@@ -1388,7 +1387,7 @@
                 <w:noProof/>
                 <w:webHidden/>
               </w:rPr>
-              <w:t>12</w:t>
+              <w:t>10</w:t>
             </w:r>
             <w:r>
               <w:rPr>
@@ -1408,12 +1407,12 @@
             <w:rPr>
               <w:rFonts w:asciiTheme="minorHAnsi" w:eastAsiaTheme="minorEastAsia" w:hAnsiTheme="minorHAnsi"/>
               <w:noProof/>
-              <w:sz w:val="22"/>
-              <w:szCs w:val="22"/>
+              <w:kern w:val="2"/>
               <w:lang w:val="fr-FR" w:eastAsia="fr-FR"/>
+              <w14:ligatures w14:val="standardContextual"/>
             </w:rPr>
           </w:pPr>
-          <w:hyperlink w:anchor="_Toc107158150" w:history="1">
+          <w:hyperlink w:anchor="_Toc172493557" w:history="1">
             <w:r>
               <w:rPr>
                 <w:rStyle w:val="Lienhypertexte"/>
@@ -1440,7 +1439,7 @@
                 <w:noProof/>
                 <w:webHidden/>
               </w:rPr>
-              <w:instrText xml:space="preserve"> PAGEREF _Toc107158150 \h </w:instrText>
+              <w:instrText xml:space="preserve"> PAGEREF _Toc172493557 \h </w:instrText>
             </w:r>
             <w:r>
               <w:rPr>
@@ -1460,7 +1459,7 @@
                 <w:noProof/>
                 <w:webHidden/>
               </w:rPr>
-              <w:t>13</w:t>
+              <w:t>11</w:t>
             </w:r>
             <w:r>
               <w:rPr>
@@ -1480,12 +1479,12 @@
             <w:rPr>
               <w:rFonts w:asciiTheme="minorHAnsi" w:eastAsiaTheme="minorEastAsia" w:hAnsiTheme="minorHAnsi"/>
               <w:noProof/>
-              <w:sz w:val="22"/>
-              <w:szCs w:val="22"/>
+              <w:kern w:val="2"/>
               <w:lang w:val="fr-FR" w:eastAsia="fr-FR"/>
+              <w14:ligatures w14:val="standardContextual"/>
             </w:rPr>
           </w:pPr>
-          <w:hyperlink w:anchor="_Toc107158151" w:history="1">
+          <w:hyperlink w:anchor="_Toc172493558" w:history="1">
             <w:r>
               <w:rPr>
                 <w:rStyle w:val="Lienhypertexte"/>
@@ -1512,7 +1511,7 @@
                 <w:noProof/>
                 <w:webHidden/>
               </w:rPr>
-              <w:instrText xml:space="preserve"> PAGEREF _Toc107158151 \h </w:instrText>
+              <w:instrText xml:space="preserve"> PAGEREF _Toc172493558 \h </w:instrText>
             </w:r>
             <w:r>
               <w:rPr>
@@ -1532,7 +1531,7 @@
                 <w:noProof/>
                 <w:webHidden/>
               </w:rPr>
-              <w:t>13</w:t>
+              <w:t>11</w:t>
             </w:r>
             <w:r>
               <w:rPr>
@@ -1552,12 +1551,12 @@
             <w:rPr>
               <w:rFonts w:asciiTheme="minorHAnsi" w:eastAsiaTheme="minorEastAsia" w:hAnsiTheme="minorHAnsi"/>
               <w:noProof/>
-              <w:sz w:val="22"/>
-              <w:szCs w:val="22"/>
+              <w:kern w:val="2"/>
               <w:lang w:val="fr-FR" w:eastAsia="fr-FR"/>
+              <w14:ligatures w14:val="standardContextual"/>
             </w:rPr>
           </w:pPr>
-          <w:hyperlink w:anchor="_Toc107158152" w:history="1">
+          <w:hyperlink w:anchor="_Toc172493559" w:history="1">
             <w:r>
               <w:rPr>
                 <w:rStyle w:val="Lienhypertexte"/>
@@ -1584,7 +1583,7 @@
                 <w:noProof/>
                 <w:webHidden/>
               </w:rPr>
-              <w:instrText xml:space="preserve"> PAGEREF _Toc107158152 \h </w:instrText>
+              <w:instrText xml:space="preserve"> PAGEREF _Toc172493559 \h </w:instrText>
             </w:r>
             <w:r>
               <w:rPr>
@@ -1604,7 +1603,7 @@
                 <w:noProof/>
                 <w:webHidden/>
               </w:rPr>
-              <w:t>13</w:t>
+              <w:t>11</w:t>
             </w:r>
             <w:r>
               <w:rPr>
@@ -1624,12 +1623,12 @@
             <w:rPr>
               <w:rFonts w:asciiTheme="minorHAnsi" w:eastAsiaTheme="minorEastAsia" w:hAnsiTheme="minorHAnsi"/>
               <w:noProof/>
-              <w:sz w:val="22"/>
-              <w:szCs w:val="22"/>
+              <w:kern w:val="2"/>
               <w:lang w:val="fr-FR" w:eastAsia="fr-FR"/>
+              <w14:ligatures w14:val="standardContextual"/>
             </w:rPr>
           </w:pPr>
-          <w:hyperlink w:anchor="_Toc107158153" w:history="1">
+          <w:hyperlink w:anchor="_Toc172493560" w:history="1">
             <w:r>
               <w:rPr>
                 <w:rStyle w:val="Lienhypertexte"/>
@@ -1656,7 +1655,7 @@
                 <w:noProof/>
                 <w:webHidden/>
               </w:rPr>
-              <w:instrText xml:space="preserve"> PAGEREF _Toc107158153 \h </w:instrText>
+              <w:instrText xml:space="preserve"> PAGEREF _Toc172493560 \h </w:instrText>
             </w:r>
             <w:r>
               <w:rPr>
@@ -1676,7 +1675,7 @@
                 <w:noProof/>
                 <w:webHidden/>
               </w:rPr>
-              <w:t>14</w:t>
+              <w:t>12</w:t>
             </w:r>
             <w:r>
               <w:rPr>
@@ -1696,12 +1695,12 @@
             <w:rPr>
               <w:rFonts w:asciiTheme="minorHAnsi" w:eastAsiaTheme="minorEastAsia" w:hAnsiTheme="minorHAnsi"/>
               <w:noProof/>
-              <w:sz w:val="22"/>
-              <w:szCs w:val="22"/>
+              <w:kern w:val="2"/>
               <w:lang w:val="fr-FR" w:eastAsia="fr-FR"/>
+              <w14:ligatures w14:val="standardContextual"/>
             </w:rPr>
           </w:pPr>
-          <w:hyperlink w:anchor="_Toc107158154" w:history="1">
+          <w:hyperlink w:anchor="_Toc172493561" w:history="1">
             <w:r>
               <w:rPr>
                 <w:rStyle w:val="Lienhypertexte"/>
@@ -1728,7 +1727,7 @@
                 <w:noProof/>
                 <w:webHidden/>
               </w:rPr>
-              <w:instrText xml:space="preserve"> PAGEREF _Toc107158154 \h </w:instrText>
+              <w:instrText xml:space="preserve"> PAGEREF _Toc172493561 \h </w:instrText>
             </w:r>
             <w:r>
               <w:rPr>
@@ -1748,7 +1747,7 @@
                 <w:noProof/>
                 <w:webHidden/>
               </w:rPr>
-              <w:t>15</w:t>
+              <w:t>13</w:t>
             </w:r>
             <w:r>
               <w:rPr>
@@ -1768,12 +1767,12 @@
             <w:rPr>
               <w:rFonts w:asciiTheme="minorHAnsi" w:eastAsiaTheme="minorEastAsia" w:hAnsiTheme="minorHAnsi"/>
               <w:noProof/>
-              <w:sz w:val="22"/>
-              <w:szCs w:val="22"/>
+              <w:kern w:val="2"/>
               <w:lang w:val="fr-FR" w:eastAsia="fr-FR"/>
+              <w14:ligatures w14:val="standardContextual"/>
             </w:rPr>
           </w:pPr>
-          <w:hyperlink w:anchor="_Toc107158155" w:history="1">
+          <w:hyperlink w:anchor="_Toc172493562" w:history="1">
             <w:r>
               <w:rPr>
                 <w:rStyle w:val="Lienhypertexte"/>
@@ -1800,7 +1799,7 @@
                 <w:noProof/>
                 <w:webHidden/>
               </w:rPr>
-              <w:instrText xml:space="preserve"> PAGEREF _Toc107158155 \h </w:instrText>
+              <w:instrText xml:space="preserve"> PAGEREF _Toc172493562 \h </w:instrText>
             </w:r>
             <w:r>
               <w:rPr>
@@ -1820,7 +1819,7 @@
                 <w:noProof/>
                 <w:webHidden/>
               </w:rPr>
-              <w:t>15</w:t>
+              <w:t>13</w:t>
             </w:r>
             <w:r>
               <w:rPr>
@@ -1902,7 +1901,7 @@
       <w:pPr>
         <w:pStyle w:val="Titre1"/>
       </w:pPr>
-      <w:bookmarkStart w:id="1" w:name="_Toc107158134"/>
+      <w:bookmarkStart w:id="1" w:name="_Toc172493541"/>
       <w:r>
         <w:t>PLUGIN OVERVIEW</w:t>
       </w:r>
@@ -1918,7 +1917,7 @@
         <w:pStyle w:val="Titre2"/>
         <w:jc w:val="both"/>
       </w:pPr>
-      <w:bookmarkStart w:id="2" w:name="_Toc107158135"/>
+      <w:bookmarkStart w:id="2" w:name="_Toc172493542"/>
       <w:r>
         <w:t>Compatibility</w:t>
       </w:r>
@@ -2431,7 +2430,7 @@
         <w:pStyle w:val="Titre2"/>
         <w:jc w:val="both"/>
       </w:pPr>
-      <w:bookmarkStart w:id="3" w:name="_Toc107158136"/>
+      <w:bookmarkStart w:id="3" w:name="_Toc172493543"/>
       <w:r>
         <w:t>Functional overview</w:t>
       </w:r>
@@ -2485,13 +2484,22 @@
     </w:p>
     <w:p>
       <w:r>
-        <w:t>Use the bundled effects or b</w:t>
-      </w:r>
-      <w:r>
-        <w:t>rowse and use hundreds of effects made by developers</w:t>
-      </w:r>
-      <w:r>
-        <w:t xml:space="preserve"> through Formula Cloud</w:t>
+        <w:t xml:space="preserve">Use </w:t>
+      </w:r>
+      <w:r>
+        <w:t xml:space="preserve">hundreds of </w:t>
+      </w:r>
+      <w:r>
+        <w:t>bundled Formula effects</w:t>
+      </w:r>
+      <w:r>
+        <w:t xml:space="preserve"> made by developers</w:t>
+      </w:r>
+      <w:r>
+        <w:t xml:space="preserve"> </w:t>
+      </w:r>
+      <w:r>
+        <w:t>from around the world</w:t>
       </w:r>
       <w:r>
         <w:t>.</w:t>
@@ -2575,7 +2583,7 @@
       <w:pPr>
         <w:pStyle w:val="Titre1"/>
       </w:pPr>
-      <w:bookmarkStart w:id="4" w:name="_Toc107158137"/>
+      <w:bookmarkStart w:id="4" w:name="_Toc172493544"/>
       <w:r>
         <w:lastRenderedPageBreak/>
         <w:t>INTERFACE</w:t>
@@ -2587,33 +2595,20 @@
         <w:t>The plugin can either be used as an effect plugin inside your DAW (VST3 or AU), or as a standalone application. In standalone mode, you can load an audio file that will be used as an input to the effects</w:t>
       </w:r>
       <w:r>
-        <w:t xml:space="preserve"> (</w:t>
-      </w:r>
-      <w:r>
-        <w:rPr>
-          <w:i/>
-          <w:iCs/>
-        </w:rPr>
-        <w:t>Load audio file</w:t>
-      </w:r>
-      <w:r>
-        <w:t xml:space="preserve"> button in the screenshot below)</w:t>
-      </w:r>
-      <w:r>
-        <w:t>.</w:t>
+        <w:t xml:space="preserve"> </w:t>
+      </w:r>
+      <w:r>
+        <w:t>from the Settings tab</w:t>
       </w:r>
     </w:p>
     <w:p/>
     <w:p>
       <w:r>
-        <w:rPr>
-          <w:noProof/>
-        </w:rPr>
         <w:drawing>
-          <wp:inline distT="0" distB="0" distL="0" distR="0" wp14:anchorId="06BE6691" wp14:editId="11732FAE">
-            <wp:extent cx="5760720" cy="3361690"/>
-            <wp:effectExtent l="0" t="0" r="0" b="0"/>
-            <wp:docPr id="1" name="Image 1" descr="Une image contenant texte&#10;&#10;Description générée automatiquement"/>
+          <wp:inline distT="0" distB="0" distL="0" distR="0" wp14:anchorId="40140FBF" wp14:editId="014F7FD6">
+            <wp:extent cx="5760720" cy="3364230"/>
+            <wp:effectExtent l="0" t="0" r="0" b="7620"/>
+            <wp:docPr id="473755216" name="Image 1" descr="Une image contenant texte, capture d’écran, logiciel, Logiciel multimédia&#10;&#10;Description générée automatiquement"/>
             <wp:cNvGraphicFramePr>
               <a:graphicFrameLocks xmlns:a="http://schemas.openxmlformats.org/drawingml/2006/main" noChangeAspect="1"/>
             </wp:cNvGraphicFramePr>
@@ -2621,7 +2616,7 @@
               <a:graphicData uri="http://schemas.openxmlformats.org/drawingml/2006/picture">
                 <pic:pic xmlns:pic="http://schemas.openxmlformats.org/drawingml/2006/picture">
                   <pic:nvPicPr>
-                    <pic:cNvPr id="1" name="Image 1" descr="Une image contenant texte&#10;&#10;Description générée automatiquement"/>
+                    <pic:cNvPr id="473755216" name="Image 1" descr="Une image contenant texte, capture d’écran, logiciel, Logiciel multimédia&#10;&#10;Description générée automatiquement"/>
                     <pic:cNvPicPr/>
                   </pic:nvPicPr>
                   <pic:blipFill>
@@ -2633,7 +2628,7 @@
                   <pic:spPr>
                     <a:xfrm>
                       <a:off x="0" y="0"/>
-                      <a:ext cx="5760720" cy="3361690"/>
+                      <a:ext cx="5760720" cy="3364230"/>
                     </a:xfrm>
                     <a:prstGeom prst="rect">
                       <a:avLst/>
@@ -2651,7 +2646,7 @@
       <w:pPr>
         <w:pStyle w:val="Titre2"/>
       </w:pPr>
-      <w:bookmarkStart w:id="5" w:name="_Toc107158138"/>
+      <w:bookmarkStart w:id="5" w:name="_Toc172493545"/>
       <w:r>
         <w:t>Tabs overview</w:t>
       </w:r>
@@ -2716,13 +2711,10 @@
           <w:b/>
           <w:bCs/>
         </w:rPr>
-        <w:t>Formula Cloud</w:t>
-      </w:r>
-      <w:r>
-        <w:t>: Browse and use hundreds of formulas created by the community. This tab requires a Formula Cloud subscription</w:t>
-      </w:r>
-      <w:r>
-        <w:t>.</w:t>
+        <w:t>All Formulas</w:t>
+      </w:r>
+      <w:r>
+        <w:t>: Browse and use hundreds of formulas created by the community.</w:t>
       </w:r>
     </w:p>
     <w:p>
@@ -2747,14 +2739,16 @@
         <w:t>.</w:t>
       </w:r>
     </w:p>
-    <w:p/>
-    <w:p/>
-    <w:p/>
+    <w:p>
+      <w:r>
+        <w:br w:type="page"/>
+      </w:r>
+    </w:p>
     <w:p>
       <w:pPr>
         <w:pStyle w:val="Titre2"/>
       </w:pPr>
-      <w:bookmarkStart w:id="6" w:name="_Toc107158139"/>
+      <w:bookmarkStart w:id="6" w:name="_Toc172493546"/>
       <w:r>
         <w:lastRenderedPageBreak/>
         <w:t>Editor</w:t>
@@ -2769,21 +2763,25 @@
         <w:t>ou can modify the active Formula</w:t>
       </w:r>
       <w:r>
-        <w:t xml:space="preserve"> i</w:t>
-      </w:r>
-      <w:r>
-        <w:t xml:space="preserve">n the </w:t>
-      </w:r>
-      <w:proofErr w:type="gramStart"/>
-      <w:r>
-        <w:t>editor,</w:t>
-      </w:r>
-      <w:r>
-        <w:t>.</w:t>
-      </w:r>
-      <w:proofErr w:type="gramEnd"/>
-      <w:r>
-        <w:t xml:space="preserve"> The typical workflow is to load or modify a formula, press the play button on the sidebar (</w:t>
+        <w:t xml:space="preserve"> in the </w:t>
+      </w:r>
+      <w:r>
+        <w:t>E</w:t>
+      </w:r>
+      <w:r>
+        <w:t>ditor</w:t>
+      </w:r>
+      <w:r>
+        <w:t xml:space="preserve"> tab</w:t>
+      </w:r>
+      <w:r>
+        <w:t>. The typical workflow is to load or modify a formula</w:t>
+      </w:r>
+      <w:r>
+        <w:t xml:space="preserve"> and </w:t>
+      </w:r>
+      <w:r>
+        <w:t>press the play button on the sidebar (</w:t>
       </w:r>
       <w:r>
         <w:rPr>
@@ -2826,10 +2824,31 @@
         </w:drawing>
       </w:r>
       <w:r>
-        <w:t xml:space="preserve">), play a song and </w:t>
-      </w:r>
-      <w:r>
-        <w:t>toggle the knobs panel (</w:t>
+        <w:t>)</w:t>
+      </w:r>
+      <w:r>
+        <w:t xml:space="preserve">. Then </w:t>
+      </w:r>
+      <w:r>
+        <w:t xml:space="preserve">play a </w:t>
+      </w:r>
+      <w:r>
+        <w:t>sound</w:t>
+      </w:r>
+      <w:r>
+        <w:t xml:space="preserve"> </w:t>
+      </w:r>
+      <w:r>
+        <w:t xml:space="preserve">from your DAW </w:t>
+      </w:r>
+      <w:r>
+        <w:t xml:space="preserve">and </w:t>
+      </w:r>
+      <w:r>
+        <w:t>use</w:t>
+      </w:r>
+      <w:r>
+        <w:t xml:space="preserve"> the knobs panel (</w:t>
       </w:r>
       <w:r>
         <w:rPr>
@@ -2877,7 +2896,13 @@
     </w:p>
     <w:p>
       <w:r>
-        <w:t>The active formulas and the knobs settings will be saved by your DAW within your project.</w:t>
+        <w:t xml:space="preserve">The active </w:t>
+      </w:r>
+      <w:r>
+        <w:t>F</w:t>
+      </w:r>
+      <w:r>
+        <w:t>ormula and the knobs settings will be saved by your DAW within your project.</w:t>
       </w:r>
     </w:p>
     <w:p/>
@@ -2885,7 +2910,7 @@
       <w:pPr>
         <w:pStyle w:val="Titre3"/>
       </w:pPr>
-      <w:bookmarkStart w:id="7" w:name="_Toc107158140"/>
+      <w:bookmarkStart w:id="7" w:name="_Toc172493547"/>
       <w:r>
         <w:t>Code editor</w:t>
       </w:r>
@@ -3041,7 +3066,7 @@
           <w:u w:val="none"/>
         </w:rPr>
       </w:pPr>
-      <w:bookmarkStart w:id="8" w:name="_Toc107158141"/>
+      <w:bookmarkStart w:id="8" w:name="_Toc172493548"/>
       <w:r>
         <w:lastRenderedPageBreak/>
         <w:t>Sidebar</w:t>
@@ -3640,7 +3665,7 @@
       <w:pPr>
         <w:pStyle w:val="Titre3"/>
       </w:pPr>
-      <w:bookmarkStart w:id="9" w:name="_Toc107158142"/>
+      <w:bookmarkStart w:id="9" w:name="_Toc172493549"/>
       <w:r>
         <w:lastRenderedPageBreak/>
         <w:t>Knobs panel</w:t>
@@ -3710,14 +3735,11 @@
     </w:p>
     <w:p>
       <w:r>
-        <w:rPr>
-          <w:noProof/>
-        </w:rPr>
         <w:drawing>
-          <wp:inline distT="0" distB="0" distL="0" distR="0" wp14:anchorId="0CE4F3EF" wp14:editId="18FACEA6">
-            <wp:extent cx="5760720" cy="3034665"/>
-            <wp:effectExtent l="0" t="0" r="0" b="0"/>
-            <wp:docPr id="18" name="Image 18" descr="Une image contenant texte, intérieur, noir, plusieurs&#10;&#10;Description générée automatiquement"/>
+          <wp:inline distT="0" distB="0" distL="0" distR="0" wp14:anchorId="6EB3B30B" wp14:editId="75D4AC72">
+            <wp:extent cx="5760720" cy="3006090"/>
+            <wp:effectExtent l="0" t="0" r="0" b="3810"/>
+            <wp:docPr id="1666269490" name="Image 1" descr="Une image contenant texte, capture d’écran, logiciel, Logiciel multimédia&#10;&#10;Description générée automatiquement"/>
             <wp:cNvGraphicFramePr>
               <a:graphicFrameLocks xmlns:a="http://schemas.openxmlformats.org/drawingml/2006/main" noChangeAspect="1"/>
             </wp:cNvGraphicFramePr>
@@ -3725,7 +3747,7 @@
               <a:graphicData uri="http://schemas.openxmlformats.org/drawingml/2006/picture">
                 <pic:pic xmlns:pic="http://schemas.openxmlformats.org/drawingml/2006/picture">
                   <pic:nvPicPr>
-                    <pic:cNvPr id="18" name="Image 18" descr="Une image contenant texte, intérieur, noir, plusieurs&#10;&#10;Description générée automatiquement"/>
+                    <pic:cNvPr id="1666269490" name="Image 1" descr="Une image contenant texte, capture d’écran, logiciel, Logiciel multimédia&#10;&#10;Description générée automatiquement"/>
                     <pic:cNvPicPr/>
                   </pic:nvPicPr>
                   <pic:blipFill>
@@ -3737,7 +3759,7 @@
                   <pic:spPr>
                     <a:xfrm>
                       <a:off x="0" y="0"/>
-                      <a:ext cx="5760720" cy="3034665"/>
+                      <a:ext cx="5760720" cy="3006090"/>
                     </a:xfrm>
                     <a:prstGeom prst="rect">
                       <a:avLst/>
@@ -3766,18 +3788,28 @@
       <w:r>
         <w:t xml:space="preserve"> </w:t>
       </w:r>
-      <w:proofErr w:type="gramStart"/>
-      <w:r>
-        <w:t>is the use of each knob</w:t>
-      </w:r>
-      <w:proofErr w:type="gramEnd"/>
+      <w:r>
+        <w:t>the use of each knob is</w:t>
+      </w:r>
       <w:r>
         <w:t xml:space="preserve">. </w:t>
       </w:r>
     </w:p>
     <w:p>
       <w:r>
-        <w:t xml:space="preserve">In your Digital Audio Workstation, the knobs are available as parameters labelled from </w:t>
+        <w:t>In</w:t>
+      </w:r>
+      <w:r>
+        <w:t>side</w:t>
+      </w:r>
+      <w:r>
+        <w:t xml:space="preserve"> your </w:t>
+      </w:r>
+      <w:r>
+        <w:t>DAW</w:t>
+      </w:r>
+      <w:r>
+        <w:t xml:space="preserve">, the knobs are available as parameters labelled from </w:t>
       </w:r>
       <w:r>
         <w:rPr>
@@ -3900,7 +3932,7 @@
       <w:pPr>
         <w:pStyle w:val="Titre2"/>
       </w:pPr>
-      <w:bookmarkStart w:id="10" w:name="_Toc107158143"/>
+      <w:bookmarkStart w:id="10" w:name="_Toc172493550"/>
       <w:r>
         <w:lastRenderedPageBreak/>
         <w:t>Saved files</w:t>
@@ -3957,14 +3989,11 @@
     </w:p>
     <w:p>
       <w:r>
-        <w:rPr>
-          <w:noProof/>
-        </w:rPr>
         <w:drawing>
-          <wp:inline distT="0" distB="0" distL="0" distR="0" wp14:anchorId="02632A51" wp14:editId="44F568D3">
-            <wp:extent cx="5543550" cy="3442721"/>
-            <wp:effectExtent l="0" t="0" r="0" b="5715"/>
-            <wp:docPr id="22" name="Image 22" descr="Une image contenant texte&#10;&#10;Description générée automatiquement"/>
+          <wp:inline distT="0" distB="0" distL="0" distR="0" wp14:anchorId="3455F7B7" wp14:editId="0C2BD435">
+            <wp:extent cx="5760720" cy="3364230"/>
+            <wp:effectExtent l="0" t="0" r="0" b="7620"/>
+            <wp:docPr id="1068340533" name="Image 1" descr="Une image contenant texte, capture d’écran, logiciel, nombre&#10;&#10;Description générée automatiquement"/>
             <wp:cNvGraphicFramePr>
               <a:graphicFrameLocks xmlns:a="http://schemas.openxmlformats.org/drawingml/2006/main" noChangeAspect="1"/>
             </wp:cNvGraphicFramePr>
@@ -3972,7 +4001,7 @@
               <a:graphicData uri="http://schemas.openxmlformats.org/drawingml/2006/picture">
                 <pic:pic xmlns:pic="http://schemas.openxmlformats.org/drawingml/2006/picture">
                   <pic:nvPicPr>
-                    <pic:cNvPr id="22" name="Image 22" descr="Une image contenant texte&#10;&#10;Description générée automatiquement"/>
+                    <pic:cNvPr id="1068340533" name="Image 1" descr="Une image contenant texte, capture d’écran, logiciel, nombre&#10;&#10;Description générée automatiquement"/>
                     <pic:cNvPicPr/>
                   </pic:nvPicPr>
                   <pic:blipFill>
@@ -3984,7 +4013,7 @@
                   <pic:spPr>
                     <a:xfrm>
                       <a:off x="0" y="0"/>
-                      <a:ext cx="5549439" cy="3446378"/>
+                      <a:ext cx="5760720" cy="3364230"/>
                     </a:xfrm>
                     <a:prstGeom prst="rect">
                       <a:avLst/>
@@ -4002,7 +4031,7 @@
       <w:pPr>
         <w:pStyle w:val="Titre3"/>
       </w:pPr>
-      <w:bookmarkStart w:id="11" w:name="_Toc107158144"/>
+      <w:bookmarkStart w:id="11" w:name="_Toc172493551"/>
       <w:r>
         <w:t>Default files</w:t>
       </w:r>
@@ -4032,7 +4061,35 @@
         <w:t xml:space="preserve"> </w:t>
       </w:r>
       <w:r>
-        <w:t>Formula, you will find a couple of formulas already present:</w:t>
+        <w:t>Formula, you will find 7 tutorials in case you wish to learn how to craft your own formulas.</w:t>
+      </w:r>
+    </w:p>
+    <w:p>
+      <w:r>
+        <w:t xml:space="preserve"> </w:t>
+      </w:r>
+    </w:p>
+    <w:p>
+      <w:pPr>
+        <w:pStyle w:val="Titre3"/>
+      </w:pPr>
+      <w:bookmarkStart w:id="12" w:name="_Ref107148927"/>
+      <w:bookmarkStart w:id="13" w:name="_Toc172493552"/>
+      <w:r>
+        <w:t>Import and export</w:t>
+      </w:r>
+      <w:bookmarkEnd w:id="12"/>
+      <w:bookmarkEnd w:id="13"/>
+    </w:p>
+    <w:p>
+      <w:r>
+        <w:t>Your saved formulas can be exported to standalone files and imported back</w:t>
+      </w:r>
+      <w:r>
+        <w:t xml:space="preserve"> from another computer</w:t>
+      </w:r>
+      <w:r>
+        <w:t>:</w:t>
       </w:r>
     </w:p>
     <w:p>
@@ -4044,7 +4101,17 @@
         </w:numPr>
       </w:pPr>
       <w:r>
-        <w:t>7 tutorials in case you wish to learn how to craft your own formulas.</w:t>
+        <w:t xml:space="preserve">Load a standalone formula file by clicking on the </w:t>
+      </w:r>
+      <w:r>
+        <w:rPr>
+          <w:i/>
+          <w:iCs/>
+        </w:rPr>
+        <w:t>Import formula</w:t>
+      </w:r>
+      <w:r>
+        <w:t xml:space="preserve"> from file button on top of the tab.</w:t>
       </w:r>
     </w:p>
     <w:p>
@@ -4056,204 +4123,23 @@
         </w:numPr>
       </w:pPr>
       <w:r>
-        <w:t>4 complete and working formulas</w:t>
-      </w:r>
-      <w:r>
-        <w:t xml:space="preserve"> you can use within your DAW:</w:t>
-      </w:r>
-    </w:p>
-    <w:p>
-      <w:pPr>
-        <w:pStyle w:val="Paragraphedeliste"/>
-        <w:numPr>
-          <w:ilvl w:val="1"/>
-          <w:numId w:val="5"/>
-        </w:numPr>
-      </w:pPr>
-      <w:proofErr w:type="spellStart"/>
-      <w:r>
-        <w:t>Warmifier</w:t>
-      </w:r>
-      <w:proofErr w:type="spellEnd"/>
-      <w:r>
-        <w:t xml:space="preserve"> and Ultra Punch are made by </w:t>
-      </w:r>
-      <w:proofErr w:type="spellStart"/>
-      <w:r>
-        <w:t>Soundspear</w:t>
-      </w:r>
-      <w:proofErr w:type="spellEnd"/>
-      <w:r>
-        <w:t>:</w:t>
-      </w:r>
-    </w:p>
-    <w:p>
-      <w:pPr>
-        <w:pStyle w:val="Paragraphedeliste"/>
-        <w:numPr>
-          <w:ilvl w:val="2"/>
-          <w:numId w:val="5"/>
-        </w:numPr>
-      </w:pPr>
-      <w:proofErr w:type="spellStart"/>
-      <w:r>
-        <w:t>Warmifier</w:t>
-      </w:r>
-      <w:proofErr w:type="spellEnd"/>
-      <w:r>
-        <w:t xml:space="preserve"> is a </w:t>
-      </w:r>
-      <w:proofErr w:type="spellStart"/>
-      <w:r>
-        <w:t>waveshaper</w:t>
-      </w:r>
-      <w:proofErr w:type="spellEnd"/>
-      <w:r>
-        <w:t xml:space="preserve"> that adds even harmonics </w:t>
-      </w:r>
-      <w:r>
-        <w:t>like</w:t>
-      </w:r>
-      <w:r>
-        <w:t xml:space="preserve"> a vacuum tube in your mid-range and low-end.</w:t>
-      </w:r>
-    </w:p>
-    <w:p>
-      <w:pPr>
-        <w:pStyle w:val="Paragraphedeliste"/>
-        <w:numPr>
-          <w:ilvl w:val="2"/>
-          <w:numId w:val="5"/>
-        </w:numPr>
-      </w:pPr>
-      <w:proofErr w:type="spellStart"/>
-      <w:r>
-        <w:t>Ultra Punch</w:t>
-      </w:r>
-      <w:proofErr w:type="spellEnd"/>
-      <w:r>
-        <w:t xml:space="preserve"> is a “sound-good-</w:t>
-      </w:r>
-      <w:proofErr w:type="spellStart"/>
-      <w:r>
-        <w:t>izer</w:t>
-      </w:r>
-      <w:proofErr w:type="spellEnd"/>
-      <w:r>
-        <w:t>” type of plugin that squashes different bands of frequencies to give more punch to your sound</w:t>
-      </w:r>
-      <w:r>
-        <w:t>.</w:t>
-      </w:r>
-    </w:p>
-    <w:p>
-      <w:pPr>
-        <w:pStyle w:val="Paragraphedeliste"/>
-        <w:numPr>
-          <w:ilvl w:val="1"/>
-          <w:numId w:val="5"/>
-        </w:numPr>
-      </w:pPr>
-      <w:proofErr w:type="spellStart"/>
-      <w:r>
-        <w:t>FireAmp</w:t>
-      </w:r>
-      <w:proofErr w:type="spellEnd"/>
-      <w:r>
-        <w:t xml:space="preserve"> and </w:t>
-      </w:r>
-      <w:proofErr w:type="spellStart"/>
-      <w:r>
-        <w:t>CStrip</w:t>
-      </w:r>
-      <w:proofErr w:type="spellEnd"/>
-      <w:r>
-        <w:t xml:space="preserve"> are courtes</w:t>
-      </w:r>
-      <w:r>
-        <w:t>ies</w:t>
-      </w:r>
-      <w:r>
-        <w:t xml:space="preserve"> from </w:t>
-      </w:r>
-      <w:proofErr w:type="spellStart"/>
-      <w:r>
-        <w:t>Airwindows</w:t>
-      </w:r>
-      <w:proofErr w:type="spellEnd"/>
-      <w:r>
-        <w:t>:</w:t>
-      </w:r>
-    </w:p>
-    <w:p>
-      <w:pPr>
-        <w:pStyle w:val="Paragraphedeliste"/>
-        <w:numPr>
-          <w:ilvl w:val="2"/>
-          <w:numId w:val="5"/>
-        </w:numPr>
-      </w:pPr>
-      <w:proofErr w:type="spellStart"/>
-      <w:r>
-        <w:t>FireAmp</w:t>
-      </w:r>
-      <w:proofErr w:type="spellEnd"/>
-      <w:r>
-        <w:t xml:space="preserve"> is a guitar cabinet simulator</w:t>
-      </w:r>
-      <w:r>
-        <w:t>.</w:t>
-      </w:r>
-    </w:p>
-    <w:p>
-      <w:pPr>
-        <w:pStyle w:val="Paragraphedeliste"/>
-        <w:numPr>
-          <w:ilvl w:val="2"/>
-          <w:numId w:val="5"/>
-        </w:numPr>
-      </w:pPr>
-      <w:proofErr w:type="spellStart"/>
-      <w:r>
-        <w:t>CStrip</w:t>
-      </w:r>
-      <w:proofErr w:type="spellEnd"/>
-      <w:r>
-        <w:t xml:space="preserve"> is a console channel strip with filters, EQ, </w:t>
-      </w:r>
-      <w:proofErr w:type="gramStart"/>
-      <w:r>
-        <w:t>gate</w:t>
-      </w:r>
-      <w:proofErr w:type="gramEnd"/>
-      <w:r>
-        <w:t xml:space="preserve"> and compressor</w:t>
-      </w:r>
-      <w:r>
-        <w:t>.</w:t>
-      </w:r>
-    </w:p>
-    <w:p>
-      <w:r>
-        <w:t xml:space="preserve"> </w:t>
-      </w:r>
-    </w:p>
-    <w:p>
-      <w:pPr>
-        <w:pStyle w:val="Titre3"/>
-      </w:pPr>
-      <w:bookmarkStart w:id="12" w:name="_Ref107148927"/>
-      <w:bookmarkStart w:id="13" w:name="_Toc107158145"/>
-      <w:r>
-        <w:lastRenderedPageBreak/>
-        <w:t>Import and export</w:t>
-      </w:r>
-      <w:bookmarkEnd w:id="12"/>
-      <w:bookmarkEnd w:id="13"/>
-    </w:p>
-    <w:p>
-      <w:r>
-        <w:t>Your saved formulas can be exported to standalone files and imported back:</w:t>
+        <w:t xml:space="preserve">Click on a formula and choose </w:t>
+      </w:r>
+      <w:r>
+        <w:rPr>
+          <w:i/>
+          <w:iCs/>
+        </w:rPr>
+        <w:t>Export to file</w:t>
+      </w:r>
+      <w:r>
+        <w:t xml:space="preserve"> to save it </w:t>
+      </w:r>
+      <w:r>
+        <w:t xml:space="preserve">as </w:t>
+      </w:r>
+      <w:r>
+        <w:t>a standalone file.</w:t>
       </w:r>
     </w:p>
     <w:p>
@@ -4265,63 +4151,13 @@
         </w:numPr>
       </w:pPr>
       <w:r>
-        <w:t xml:space="preserve">Load a standalone formula file by clicking on the </w:t>
+        <w:t xml:space="preserve">Click on a formula and choose </w:t>
       </w:r>
       <w:r>
         <w:rPr>
           <w:i/>
           <w:iCs/>
         </w:rPr>
-        <w:t>Import formula</w:t>
-      </w:r>
-      <w:r>
-        <w:t xml:space="preserve"> from file button on top of the tab.</w:t>
-      </w:r>
-    </w:p>
-    <w:p>
-      <w:pPr>
-        <w:pStyle w:val="Paragraphedeliste"/>
-        <w:numPr>
-          <w:ilvl w:val="0"/>
-          <w:numId w:val="5"/>
-        </w:numPr>
-      </w:pPr>
-      <w:r>
-        <w:t xml:space="preserve">Click on a formula and choose </w:t>
-      </w:r>
-      <w:r>
-        <w:rPr>
-          <w:i/>
-          <w:iCs/>
-        </w:rPr>
-        <w:t>Export to file</w:t>
-      </w:r>
-      <w:r>
-        <w:t xml:space="preserve"> to save it </w:t>
-      </w:r>
-      <w:r>
-        <w:t xml:space="preserve">as </w:t>
-      </w:r>
-      <w:r>
-        <w:t>a standalone file.</w:t>
-      </w:r>
-    </w:p>
-    <w:p>
-      <w:pPr>
-        <w:pStyle w:val="Paragraphedeliste"/>
-        <w:numPr>
-          <w:ilvl w:val="0"/>
-          <w:numId w:val="5"/>
-        </w:numPr>
-      </w:pPr>
-      <w:r>
-        <w:t xml:space="preserve">Click on a formula and choose </w:t>
-      </w:r>
-      <w:r>
-        <w:rPr>
-          <w:i/>
-          <w:iCs/>
-        </w:rPr>
         <w:t>Delete</w:t>
       </w:r>
       <w:r>
@@ -4329,28 +4165,30 @@
       </w:r>
     </w:p>
     <w:p>
-      <w:pPr>
-        <w:pStyle w:val="Paragraphedeliste"/>
-        <w:numPr>
-          <w:ilvl w:val="0"/>
-          <w:numId w:val="5"/>
-        </w:numPr>
-      </w:pPr>
-      <w:r>
-        <w:t xml:space="preserve">Click on a formula and choose </w:t>
-      </w:r>
-      <w:r>
-        <w:rPr>
-          <w:i/>
-          <w:iCs/>
-        </w:rPr>
-        <w:t>Publish online</w:t>
-      </w:r>
-      <w:r>
-        <w:t xml:space="preserve"> to make it available to all the other Formula users on Formula Cloud!</w:t>
-      </w:r>
-    </w:p>
-    <w:p/>
+      <w:r>
+        <w:t>You can make your formula available to everyone</w:t>
+      </w:r>
+      <w:r>
+        <w:t xml:space="preserve"> </w:t>
+      </w:r>
+      <w:r>
+        <w:t>through our open-source repository at</w:t>
+      </w:r>
+      <w:r>
+        <w:t xml:space="preserve"> </w:t>
+      </w:r>
+      <w:hyperlink r:id="rId24" w:history="1">
+        <w:r>
+          <w:rPr>
+            <w:rStyle w:val="Lienhypertexte"/>
+          </w:rPr>
+          <w:t>https://github.com/soundspear/formula</w:t>
+        </w:r>
+      </w:hyperlink>
+      <w:r>
+        <w:t>.</w:t>
+      </w:r>
+    </w:p>
     <w:p>
       <w:pPr>
         <w:rPr>
@@ -4368,85 +4206,27 @@
       <w:pPr>
         <w:pStyle w:val="Titre2"/>
       </w:pPr>
-      <w:bookmarkStart w:id="14" w:name="_Toc107158146"/>
+      <w:bookmarkStart w:id="14" w:name="_Toc172493553"/>
       <w:r>
         <w:lastRenderedPageBreak/>
-        <w:t>Formula cloud</w:t>
+        <w:t>All Formulas</w:t>
       </w:r>
       <w:bookmarkEnd w:id="14"/>
     </w:p>
     <w:p>
       <w:r>
-        <w:t>Formula Cloud is an online cloud integrated into the Formula plugin, where you can:</w:t>
-      </w:r>
-    </w:p>
-    <w:p>
-      <w:pPr>
-        <w:pStyle w:val="Paragraphedeliste"/>
-        <w:numPr>
-          <w:ilvl w:val="0"/>
-          <w:numId w:val="5"/>
-        </w:numPr>
-      </w:pPr>
-      <w:r>
-        <w:t xml:space="preserve">Publish your own formulas (See </w:t>
-      </w:r>
-      <w:r>
-        <w:rPr>
-          <w:i/>
-          <w:iCs/>
-        </w:rPr>
-        <w:fldChar w:fldCharType="begin"/>
-      </w:r>
-      <w:r>
-        <w:rPr>
-          <w:i/>
-          <w:iCs/>
-        </w:rPr>
-        <w:instrText xml:space="preserve"> REF _Ref107148927 \h </w:instrText>
-      </w:r>
-      <w:r>
-        <w:rPr>
-          <w:i/>
-          <w:iCs/>
-        </w:rPr>
-        <w:instrText xml:space="preserve"> \* MERGEFORMAT </w:instrText>
-      </w:r>
-      <w:r>
-        <w:rPr>
-          <w:i/>
-          <w:iCs/>
-        </w:rPr>
-      </w:r>
-      <w:r>
-        <w:rPr>
-          <w:i/>
-          <w:iCs/>
-        </w:rPr>
-        <w:fldChar w:fldCharType="separate"/>
-      </w:r>
-      <w:r>
-        <w:rPr>
-          <w:i/>
-          <w:iCs/>
-        </w:rPr>
-        <w:t>Import and export</w:t>
-      </w:r>
-      <w:r>
-        <w:rPr>
-          <w:i/>
-          <w:iCs/>
-        </w:rPr>
-        <w:fldChar w:fldCharType="end"/>
-      </w:r>
-      <w:r>
-        <w:t xml:space="preserve"> section</w:t>
-      </w:r>
-      <w:r>
-        <w:t>)</w:t>
-      </w:r>
-      <w:r>
-        <w:t>.</w:t>
+        <w:t xml:space="preserve">In the All Formulas, you can find all the community-created formulas, that were exported and further shared in our open-source </w:t>
+      </w:r>
+      <w:hyperlink r:id="rId25" w:history="1">
+        <w:r>
+          <w:rPr>
+            <w:rStyle w:val="Lienhypertexte"/>
+          </w:rPr>
+          <w:t>Git repository</w:t>
+        </w:r>
+      </w:hyperlink>
+      <w:r>
+        <w:t xml:space="preserve">. </w:t>
       </w:r>
     </w:p>
     <w:p>
@@ -4483,7 +4263,7 @@
                     <pic:cNvPicPr/>
                   </pic:nvPicPr>
                   <pic:blipFill>
-                    <a:blip r:embed="rId24"/>
+                    <a:blip r:embed="rId26"/>
                     <a:stretch>
                       <a:fillRect/>
                     </a:stretch>
@@ -4523,14 +4303,11 @@
         <w:jc w:val="center"/>
       </w:pPr>
       <w:r>
-        <w:rPr>
-          <w:noProof/>
-        </w:rPr>
         <w:drawing>
-          <wp:inline distT="0" distB="0" distL="0" distR="0" wp14:anchorId="76F874E1" wp14:editId="420A3B6A">
-            <wp:extent cx="4362450" cy="2711143"/>
-            <wp:effectExtent l="0" t="0" r="0" b="0"/>
-            <wp:docPr id="25" name="Image 25" descr="Une image contenant texte&#10;&#10;Description générée automatiquement"/>
+          <wp:inline distT="0" distB="0" distL="0" distR="0" wp14:anchorId="2C2EAFD5" wp14:editId="17009E1D">
+            <wp:extent cx="5119687" cy="2946980"/>
+            <wp:effectExtent l="0" t="0" r="5080" b="6350"/>
+            <wp:docPr id="1486588232" name="Image 1" descr="Une image contenant texte, capture d’écran, logiciel, nombre&#10;&#10;Description générée automatiquement"/>
             <wp:cNvGraphicFramePr>
               <a:graphicFrameLocks xmlns:a="http://schemas.openxmlformats.org/drawingml/2006/main" noChangeAspect="1"/>
             </wp:cNvGraphicFramePr>
@@ -4538,11 +4315,11 @@
               <a:graphicData uri="http://schemas.openxmlformats.org/drawingml/2006/picture">
                 <pic:pic xmlns:pic="http://schemas.openxmlformats.org/drawingml/2006/picture">
                   <pic:nvPicPr>
-                    <pic:cNvPr id="25" name="Image 25" descr="Une image contenant texte&#10;&#10;Description générée automatiquement"/>
+                    <pic:cNvPr id="1486588232" name="Image 1" descr="Une image contenant texte, capture d’écran, logiciel, nombre&#10;&#10;Description générée automatiquement"/>
                     <pic:cNvPicPr/>
                   </pic:nvPicPr>
                   <pic:blipFill>
-                    <a:blip r:embed="rId25"/>
+                    <a:blip r:embed="rId27"/>
                     <a:stretch>
                       <a:fillRect/>
                     </a:stretch>
@@ -4550,7 +4327,7 @@
                   <pic:spPr>
                     <a:xfrm>
                       <a:off x="0" y="0"/>
-                      <a:ext cx="4367231" cy="2714114"/>
+                      <a:ext cx="5124816" cy="2949933"/>
                     </a:xfrm>
                     <a:prstGeom prst="rect">
                       <a:avLst/>
@@ -4605,130 +4382,41 @@
       <w:pPr>
         <w:jc w:val="center"/>
       </w:pPr>
-      <w:r>
+    </w:p>
+    <w:p>
+      <w:pPr>
+        <w:pStyle w:val="Titre2"/>
+      </w:pPr>
+      <w:bookmarkStart w:id="15" w:name="_Toc172493554"/>
+      <w:r>
+        <w:t>Settings</w:t>
+      </w:r>
+      <w:bookmarkEnd w:id="15"/>
+    </w:p>
+    <w:p>
+      <w:pPr>
         <w:rPr>
           <w:noProof/>
         </w:rPr>
-        <w:drawing>
-          <wp:inline distT="0" distB="0" distL="0" distR="0" wp14:anchorId="56E86DF7" wp14:editId="001EC37E">
-            <wp:extent cx="4368800" cy="2715090"/>
-            <wp:effectExtent l="0" t="0" r="0" b="9525"/>
-            <wp:docPr id="27" name="Image 27" descr="Une image contenant texte&#10;&#10;Description générée automatiquement"/>
-            <wp:cNvGraphicFramePr>
-              <a:graphicFrameLocks xmlns:a="http://schemas.openxmlformats.org/drawingml/2006/main" noChangeAspect="1"/>
-            </wp:cNvGraphicFramePr>
-            <a:graphic xmlns:a="http://schemas.openxmlformats.org/drawingml/2006/main">
-              <a:graphicData uri="http://schemas.openxmlformats.org/drawingml/2006/picture">
-                <pic:pic xmlns:pic="http://schemas.openxmlformats.org/drawingml/2006/picture">
-                  <pic:nvPicPr>
-                    <pic:cNvPr id="27" name="Image 27" descr="Une image contenant texte&#10;&#10;Description générée automatiquement"/>
-                    <pic:cNvPicPr/>
-                  </pic:nvPicPr>
-                  <pic:blipFill>
-                    <a:blip r:embed="rId26"/>
-                    <a:stretch>
-                      <a:fillRect/>
-                    </a:stretch>
-                  </pic:blipFill>
-                  <pic:spPr>
-                    <a:xfrm>
-                      <a:off x="0" y="0"/>
-                      <a:ext cx="4373406" cy="2717952"/>
-                    </a:xfrm>
-                    <a:prstGeom prst="rect">
-                      <a:avLst/>
-                    </a:prstGeom>
-                  </pic:spPr>
-                </pic:pic>
-              </a:graphicData>
-            </a:graphic>
-          </wp:inline>
-        </w:drawing>
-      </w:r>
-    </w:p>
-    <w:p>
-      <w:pPr>
-        <w:pStyle w:val="Titre2"/>
-      </w:pPr>
-      <w:bookmarkStart w:id="15" w:name="_Toc107158147"/>
-      <w:r>
-        <w:lastRenderedPageBreak/>
-        <w:t>Settings</w:t>
-      </w:r>
-      <w:bookmarkEnd w:id="15"/>
-    </w:p>
-    <w:p>
-      <w:pPr>
+      </w:pPr>
+      <w:r>
+        <w:t>You can change application settings under the Settings tab.</w:t>
+      </w:r>
+      <w:r>
         <w:rPr>
           <w:noProof/>
         </w:rPr>
-      </w:pPr>
-      <w:r>
-        <w:t>You can change application settings under the Settings tab.</w:t>
-      </w:r>
-      <w:r>
+        <w:t xml:space="preserve"> </w:t>
+      </w:r>
+    </w:p>
+    <w:p>
+      <w:pPr>
         <w:rPr>
           <w:noProof/>
         </w:rPr>
-        <w:t xml:space="preserve"> </w:t>
-      </w:r>
-    </w:p>
-    <w:p>
-      <w:pPr>
-        <w:rPr>
-          <w:noProof/>
-        </w:rPr>
-      </w:pPr>
-    </w:p>
-    <w:p>
-      <w:r>
-        <w:rPr>
-          <w:noProof/>
-        </w:rPr>
-        <w:drawing>
-          <wp:inline distT="0" distB="0" distL="0" distR="0" wp14:anchorId="32C202AA" wp14:editId="0DC90137">
-            <wp:extent cx="5760720" cy="1682750"/>
-            <wp:effectExtent l="0" t="0" r="0" b="0"/>
-            <wp:docPr id="29" name="Image 29"/>
-            <wp:cNvGraphicFramePr>
-              <a:graphicFrameLocks xmlns:a="http://schemas.openxmlformats.org/drawingml/2006/main" noChangeAspect="1"/>
-            </wp:cNvGraphicFramePr>
-            <a:graphic xmlns:a="http://schemas.openxmlformats.org/drawingml/2006/main">
-              <a:graphicData uri="http://schemas.openxmlformats.org/drawingml/2006/picture">
-                <pic:pic xmlns:pic="http://schemas.openxmlformats.org/drawingml/2006/picture">
-                  <pic:nvPicPr>
-                    <pic:cNvPr id="1" name=""/>
-                    <pic:cNvPicPr/>
-                  </pic:nvPicPr>
-                  <pic:blipFill rotWithShape="1">
-                    <a:blip r:embed="rId27"/>
-                    <a:srcRect b="52997"/>
-                    <a:stretch/>
-                  </pic:blipFill>
-                  <pic:spPr bwMode="auto">
-                    <a:xfrm>
-                      <a:off x="0" y="0"/>
-                      <a:ext cx="5760720" cy="1682750"/>
-                    </a:xfrm>
-                    <a:prstGeom prst="rect">
-                      <a:avLst/>
-                    </a:prstGeom>
-                    <a:ln>
-                      <a:noFill/>
-                    </a:ln>
-                    <a:extLst>
-                      <a:ext uri="{53640926-AAD7-44D8-BBD7-CCE9431645EC}">
-                        <a14:shadowObscured xmlns:a14="http://schemas.microsoft.com/office/drawing/2010/main"/>
-                      </a:ext>
-                    </a:extLst>
-                  </pic:spPr>
-                </pic:pic>
-              </a:graphicData>
-            </a:graphic>
-          </wp:inline>
-        </w:drawing>
-      </w:r>
-    </w:p>
+      </w:pPr>
+    </w:p>
+    <w:p/>
     <w:p/>
     <w:p>
       <w:pPr>
@@ -4748,8 +4436,8 @@
       <w:pPr>
         <w:pStyle w:val="Titre1"/>
       </w:pPr>
-      <w:bookmarkStart w:id="17" w:name="_Toc107158148"/>
-      <w:bookmarkStart w:id="18" w:name="_Ref107660037"/>
+      <w:bookmarkStart w:id="17" w:name="_Ref107660037"/>
+      <w:bookmarkStart w:id="18" w:name="_Toc172493555"/>
       <w:r>
         <w:lastRenderedPageBreak/>
         <w:t>DEVELOPER GUIDE</w:t>
@@ -4763,7 +4451,7 @@
         <w:pStyle w:val="Titre2"/>
       </w:pPr>
       <w:bookmarkStart w:id="19" w:name="_Ref107152944"/>
-      <w:bookmarkStart w:id="20" w:name="_Toc107158149"/>
+      <w:bookmarkStart w:id="20" w:name="_Toc172493556"/>
       <w:r>
         <w:t>Audio programming 101</w:t>
       </w:r>
@@ -5367,7 +5055,7 @@
       <w:pPr>
         <w:pStyle w:val="Titre2"/>
       </w:pPr>
-      <w:bookmarkStart w:id="21" w:name="_Toc107158150"/>
+      <w:bookmarkStart w:id="21" w:name="_Toc172493557"/>
       <w:r>
         <w:t>Programming in Formula</w:t>
       </w:r>
@@ -5377,7 +5065,7 @@
       <w:pPr>
         <w:pStyle w:val="Titre3"/>
       </w:pPr>
-      <w:bookmarkStart w:id="22" w:name="_Toc107158151"/>
+      <w:bookmarkStart w:id="22" w:name="_Toc172493558"/>
       <w:r>
         <w:t>C</w:t>
       </w:r>
@@ -5589,7 +5277,16 @@
           <w:b/>
           <w:bCs/>
         </w:rPr>
-        <w:t xml:space="preserve">Includes and </w:t>
+        <w:t>Includes and preprocessor</w:t>
+      </w:r>
+      <w:r>
+        <w:t xml:space="preserve">: For safety reasons, we </w:t>
+      </w:r>
+      <w:r>
+        <w:t xml:space="preserve">have </w:t>
+      </w:r>
+      <w:r>
+        <w:t>disabled the C preprocessor and it is not possible to include libraries in a formula. However, both the standard C library (</w:t>
       </w:r>
       <w:proofErr w:type="spellStart"/>
       <w:r>
@@ -5597,25 +5294,17 @@
           <w:b/>
           <w:bCs/>
         </w:rPr>
-        <w:t>preprocessor</w:t>
+        <w:t>stdlib.h</w:t>
       </w:r>
       <w:proofErr w:type="spellEnd"/>
       <w:r>
-        <w:t xml:space="preserve">: For safety reasons, we </w:t>
-      </w:r>
-      <w:r>
-        <w:t xml:space="preserve">have </w:t>
-      </w:r>
-      <w:r>
-        <w:t xml:space="preserve">disabled the C </w:t>
-      </w:r>
-      <w:proofErr w:type="spellStart"/>
-      <w:r>
-        <w:t>preprocessor</w:t>
-      </w:r>
-      <w:proofErr w:type="spellEnd"/>
-      <w:r>
-        <w:t xml:space="preserve"> and it is not possible to include libraries in a formula. However, both the standard C library (</w:t>
+        <w:t>) and the</w:t>
+      </w:r>
+      <w:r>
+        <w:t xml:space="preserve"> standard</w:t>
+      </w:r>
+      <w:r>
+        <w:t xml:space="preserve"> math library (</w:t>
       </w:r>
       <w:proofErr w:type="spellStart"/>
       <w:r>
@@ -5623,59 +5312,33 @@
           <w:b/>
           <w:bCs/>
         </w:rPr>
-        <w:t>stdlib.h</w:t>
+        <w:t>math.h</w:t>
       </w:r>
       <w:proofErr w:type="spellEnd"/>
       <w:r>
-        <w:t>) and the</w:t>
-      </w:r>
-      <w:r>
-        <w:t xml:space="preserve"> standard</w:t>
-      </w:r>
-      <w:r>
-        <w:t xml:space="preserve"> math library (</w:t>
-      </w:r>
-      <w:proofErr w:type="spellStart"/>
+        <w:t>) are included in all formulas.</w:t>
+      </w:r>
+    </w:p>
+    <w:p>
       <w:r>
         <w:rPr>
           <w:b/>
           <w:bCs/>
         </w:rPr>
-        <w:t>math.h</w:t>
-      </w:r>
-      <w:proofErr w:type="spellEnd"/>
-      <w:r>
-        <w:t>) are included in all formulas.</w:t>
-      </w:r>
-    </w:p>
-    <w:p>
+        <w:t xml:space="preserve">- </w:t>
+      </w:r>
       <w:r>
         <w:rPr>
           <w:b/>
           <w:bCs/>
         </w:rPr>
-        <w:t xml:space="preserve">- </w:t>
-      </w:r>
-      <w:r>
-        <w:rPr>
-          <w:b/>
-          <w:bCs/>
-        </w:rPr>
         <w:t>Security</w:t>
       </w:r>
       <w:r>
         <w:t>:</w:t>
       </w:r>
       <w:r>
-        <w:t xml:space="preserve"> Along with disabling the </w:t>
-      </w:r>
-      <w:proofErr w:type="spellStart"/>
-      <w:r>
-        <w:t>preprocessor</w:t>
-      </w:r>
-      <w:proofErr w:type="spellEnd"/>
-      <w:r>
-        <w:t xml:space="preserve">, several security measures have been enforced: dynamic memory allocation and management, system or exec </w:t>
+        <w:t xml:space="preserve"> Along with disabling the preprocessor, several security measures have been enforced: dynamic memory allocation and management, system or exec </w:t>
       </w:r>
       <w:proofErr w:type="gramStart"/>
       <w:r>
@@ -5692,7 +5355,7 @@
         <w:pStyle w:val="Titre3"/>
       </w:pPr>
       <w:bookmarkStart w:id="23" w:name="_Ref107154833"/>
-      <w:bookmarkStart w:id="24" w:name="_Toc107158152"/>
+      <w:bookmarkStart w:id="24" w:name="_Toc172493559"/>
       <w:r>
         <w:t>Formula architecture</w:t>
       </w:r>
@@ -5878,10 +5541,7 @@
         <w:t xml:space="preserve"> button after entering this code, you will notice that the original signal is left untouched. That is normal, as we </w:t>
       </w:r>
       <w:r>
-        <w:t>are</w:t>
-      </w:r>
-      <w:r>
-        <w:t xml:space="preserve"> </w:t>
+        <w:t xml:space="preserve">are </w:t>
       </w:r>
       <w:r>
         <w:t>not modify</w:t>
@@ -6016,7 +5676,7 @@
         <w:pStyle w:val="Titre3"/>
       </w:pPr>
       <w:bookmarkStart w:id="25" w:name="_Ref107154783"/>
-      <w:bookmarkStart w:id="26" w:name="_Toc107158153"/>
+      <w:bookmarkStart w:id="26" w:name="_Toc172493560"/>
       <w:r>
         <w:t>Macros</w:t>
       </w:r>
@@ -6567,7 +6227,7 @@
       <w:pPr>
         <w:pStyle w:val="Titre3"/>
       </w:pPr>
-      <w:bookmarkStart w:id="27" w:name="_Toc107158154"/>
+      <w:bookmarkStart w:id="27" w:name="_Toc172493561"/>
       <w:r>
         <w:lastRenderedPageBreak/>
         <w:t>State management</w:t>
@@ -6796,7 +6456,7 @@
       <w:pPr>
         <w:pStyle w:val="Titre3"/>
       </w:pPr>
-      <w:bookmarkStart w:id="28" w:name="_Toc107158155"/>
+      <w:bookmarkStart w:id="28" w:name="_Toc172493562"/>
       <w:r>
         <w:t>Multi-mono and Stereo</w:t>
       </w:r>
@@ -7114,7 +6774,7 @@
 </file>
 
 <file path=word/endnotes.xml><?xml version="1.0" encoding="utf-8"?>
-<w:endnotes xmlns:wpc="http://schemas.microsoft.com/office/word/2010/wordprocessingCanvas" xmlns:cx="http://schemas.microsoft.com/office/drawing/2014/chartex" xmlns:cx1="http://schemas.microsoft.com/office/drawing/2015/9/8/chartex" xmlns:cx2="http://schemas.microsoft.com/office/drawing/2015/10/21/chartex" xmlns:cx3="http://schemas.microsoft.com/office/drawing/2016/5/9/chartex" xmlns:cx4="http://schemas.microsoft.com/office/drawing/2016/5/10/chartex" xmlns:cx5="http://schemas.microsoft.com/office/drawing/2016/5/11/chartex" xmlns:cx6="http://schemas.microsoft.com/office/drawing/2016/5/12/chartex" xmlns:cx7="http://schemas.microsoft.com/office/drawing/2016/5/13/chartex" xmlns:cx8="http://schemas.microsoft.com/office/drawing/2016/5/14/chartex" xmlns:mc="http://schemas.openxmlformats.org/markup-compatibility/2006" xmlns:aink="http://schemas.microsoft.com/office/drawing/2016/ink" xmlns:am3d="http://schemas.microsoft.com/office/drawing/2017/model3d" xmlns:o="urn:schemas-microsoft-com:office:office" xmlns:oel="http://schemas.microsoft.com/office/2019/extlst" xmlns:r="http://schemas.openxmlformats.org/officeDocument/2006/relationships" xmlns:m="http://schemas.openxmlformats.org/officeDocument/2006/math" xmlns:v="urn:schemas-microsoft-com:vml" xmlns:wp14="http://schemas.microsoft.com/office/word/2010/wordprocessingDrawing" xmlns:wp="http://schemas.openxmlformats.org/drawingml/2006/wordprocessingDrawing" xmlns:w10="urn:schemas-microsoft-com:office:word" xmlns:w="http://schemas.openxmlformats.org/wordprocessingml/2006/main" xmlns:w14="http://schemas.microsoft.com/office/word/2010/wordml" xmlns:w15="http://schemas.microsoft.com/office/word/2012/wordml" xmlns:w16cex="http://schemas.microsoft.com/office/word/2018/wordml/cex" xmlns:w16cid="http://schemas.microsoft.com/office/word/2016/wordml/cid" xmlns:w16="http://schemas.microsoft.com/office/word/2018/wordml" xmlns:w16sdtdh="http://schemas.microsoft.com/office/word/2020/wordml/sdtdatahash" xmlns:w16se="http://schemas.microsoft.com/office/word/2015/wordml/symex" xmlns:wpg="http://schemas.microsoft.com/office/word/2010/wordprocessingGroup" xmlns:wpi="http://schemas.microsoft.com/office/word/2010/wordprocessingInk" xmlns:wne="http://schemas.microsoft.com/office/word/2006/wordml" xmlns:wps="http://schemas.microsoft.com/office/word/2010/wordprocessingShape" mc:Ignorable="w14 w15 w16se w16cid w16 w16cex w16sdtdh wp14">
+<w:endnotes xmlns:wpc="http://schemas.microsoft.com/office/word/2010/wordprocessingCanvas" xmlns:cx="http://schemas.microsoft.com/office/drawing/2014/chartex" xmlns:cx1="http://schemas.microsoft.com/office/drawing/2015/9/8/chartex" xmlns:cx2="http://schemas.microsoft.com/office/drawing/2015/10/21/chartex" xmlns:cx3="http://schemas.microsoft.com/office/drawing/2016/5/9/chartex" xmlns:cx4="http://schemas.microsoft.com/office/drawing/2016/5/10/chartex" xmlns:cx5="http://schemas.microsoft.com/office/drawing/2016/5/11/chartex" xmlns:cx6="http://schemas.microsoft.com/office/drawing/2016/5/12/chartex" xmlns:cx7="http://schemas.microsoft.com/office/drawing/2016/5/13/chartex" xmlns:cx8="http://schemas.microsoft.com/office/drawing/2016/5/14/chartex" xmlns:mc="http://schemas.openxmlformats.org/markup-compatibility/2006" xmlns:aink="http://schemas.microsoft.com/office/drawing/2016/ink" xmlns:am3d="http://schemas.microsoft.com/office/drawing/2017/model3d" xmlns:o="urn:schemas-microsoft-com:office:office" xmlns:oel="http://schemas.microsoft.com/office/2019/extlst" xmlns:r="http://schemas.openxmlformats.org/officeDocument/2006/relationships" xmlns:m="http://schemas.openxmlformats.org/officeDocument/2006/math" xmlns:v="urn:schemas-microsoft-com:vml" xmlns:wp14="http://schemas.microsoft.com/office/word/2010/wordprocessingDrawing" xmlns:wp="http://schemas.openxmlformats.org/drawingml/2006/wordprocessingDrawing" xmlns:w10="urn:schemas-microsoft-com:office:word" xmlns:w="http://schemas.openxmlformats.org/wordprocessingml/2006/main" xmlns:w14="http://schemas.microsoft.com/office/word/2010/wordml" xmlns:w15="http://schemas.microsoft.com/office/word/2012/wordml" xmlns:w16cex="http://schemas.microsoft.com/office/word/2018/wordml/cex" xmlns:w16cid="http://schemas.microsoft.com/office/word/2016/wordml/cid" xmlns:w16="http://schemas.microsoft.com/office/word/2018/wordml" xmlns:w16du="http://schemas.microsoft.com/office/word/2023/wordml/word16du" xmlns:w16sdtdh="http://schemas.microsoft.com/office/word/2020/wordml/sdtdatahash" xmlns:w16se="http://schemas.microsoft.com/office/word/2015/wordml/symex" xmlns:wpg="http://schemas.microsoft.com/office/word/2010/wordprocessingGroup" xmlns:wpi="http://schemas.microsoft.com/office/word/2010/wordprocessingInk" xmlns:wne="http://schemas.microsoft.com/office/word/2006/wordml" xmlns:wps="http://schemas.microsoft.com/office/word/2010/wordprocessingShape" mc:Ignorable="w14 w15 w16se w16cid w16 w16cex w16sdtdh w16du wp14">
   <w:endnote w:type="separator" w:id="-1">
     <w:p>
       <w:r>
@@ -7137,7 +6797,7 @@
 </file>
 
 <file path=word/footer1.xml><?xml version="1.0" encoding="utf-8"?>
-<w:ftr xmlns:wpc="http://schemas.microsoft.com/office/word/2010/wordprocessingCanvas" xmlns:cx="http://schemas.microsoft.com/office/drawing/2014/chartex" xmlns:cx1="http://schemas.microsoft.com/office/drawing/2015/9/8/chartex" xmlns:cx2="http://schemas.microsoft.com/office/drawing/2015/10/21/chartex" xmlns:cx3="http://schemas.microsoft.com/office/drawing/2016/5/9/chartex" xmlns:cx4="http://schemas.microsoft.com/office/drawing/2016/5/10/chartex" xmlns:cx5="http://schemas.microsoft.com/office/drawing/2016/5/11/chartex" xmlns:cx6="http://schemas.microsoft.com/office/drawing/2016/5/12/chartex" xmlns:cx7="http://schemas.microsoft.com/office/drawing/2016/5/13/chartex" xmlns:cx8="http://schemas.microsoft.com/office/drawing/2016/5/14/chartex" xmlns:mc="http://schemas.openxmlformats.org/markup-compatibility/2006" xmlns:aink="http://schemas.microsoft.com/office/drawing/2016/ink" xmlns:am3d="http://schemas.microsoft.com/office/drawing/2017/model3d" xmlns:o="urn:schemas-microsoft-com:office:office" xmlns:oel="http://schemas.microsoft.com/office/2019/extlst" xmlns:r="http://schemas.openxmlformats.org/officeDocument/2006/relationships" xmlns:m="http://schemas.openxmlformats.org/officeDocument/2006/math" xmlns:v="urn:schemas-microsoft-com:vml" xmlns:wp14="http://schemas.microsoft.com/office/word/2010/wordprocessingDrawing" xmlns:wp="http://schemas.openxmlformats.org/drawingml/2006/wordprocessingDrawing" xmlns:w10="urn:schemas-microsoft-com:office:word" xmlns:w="http://schemas.openxmlformats.org/wordprocessingml/2006/main" xmlns:w14="http://schemas.microsoft.com/office/word/2010/wordml" xmlns:w15="http://schemas.microsoft.com/office/word/2012/wordml" xmlns:w16cex="http://schemas.microsoft.com/office/word/2018/wordml/cex" xmlns:w16cid="http://schemas.microsoft.com/office/word/2016/wordml/cid" xmlns:w16="http://schemas.microsoft.com/office/word/2018/wordml" xmlns:w16sdtdh="http://schemas.microsoft.com/office/word/2020/wordml/sdtdatahash" xmlns:w16se="http://schemas.microsoft.com/office/word/2015/wordml/symex" xmlns:wpg="http://schemas.microsoft.com/office/word/2010/wordprocessingGroup" xmlns:wpi="http://schemas.microsoft.com/office/word/2010/wordprocessingInk" xmlns:wne="http://schemas.microsoft.com/office/word/2006/wordml" xmlns:wps="http://schemas.microsoft.com/office/word/2010/wordprocessingShape" mc:Ignorable="w14 w15 w16se w16cid w16 w16cex w16sdtdh wp14">
+<w:ftr xmlns:wpc="http://schemas.microsoft.com/office/word/2010/wordprocessingCanvas" xmlns:cx="http://schemas.microsoft.com/office/drawing/2014/chartex" xmlns:cx1="http://schemas.microsoft.com/office/drawing/2015/9/8/chartex" xmlns:cx2="http://schemas.microsoft.com/office/drawing/2015/10/21/chartex" xmlns:cx3="http://schemas.microsoft.com/office/drawing/2016/5/9/chartex" xmlns:cx4="http://schemas.microsoft.com/office/drawing/2016/5/10/chartex" xmlns:cx5="http://schemas.microsoft.com/office/drawing/2016/5/11/chartex" xmlns:cx6="http://schemas.microsoft.com/office/drawing/2016/5/12/chartex" xmlns:cx7="http://schemas.microsoft.com/office/drawing/2016/5/13/chartex" xmlns:cx8="http://schemas.microsoft.com/office/drawing/2016/5/14/chartex" xmlns:mc="http://schemas.openxmlformats.org/markup-compatibility/2006" xmlns:aink="http://schemas.microsoft.com/office/drawing/2016/ink" xmlns:am3d="http://schemas.microsoft.com/office/drawing/2017/model3d" xmlns:o="urn:schemas-microsoft-com:office:office" xmlns:oel="http://schemas.microsoft.com/office/2019/extlst" xmlns:r="http://schemas.openxmlformats.org/officeDocument/2006/relationships" xmlns:m="http://schemas.openxmlformats.org/officeDocument/2006/math" xmlns:v="urn:schemas-microsoft-com:vml" xmlns:wp14="http://schemas.microsoft.com/office/word/2010/wordprocessingDrawing" xmlns:wp="http://schemas.openxmlformats.org/drawingml/2006/wordprocessingDrawing" xmlns:w10="urn:schemas-microsoft-com:office:word" xmlns:w="http://schemas.openxmlformats.org/wordprocessingml/2006/main" xmlns:w14="http://schemas.microsoft.com/office/word/2010/wordml" xmlns:w15="http://schemas.microsoft.com/office/word/2012/wordml" xmlns:w16cex="http://schemas.microsoft.com/office/word/2018/wordml/cex" xmlns:w16cid="http://schemas.microsoft.com/office/word/2016/wordml/cid" xmlns:w16="http://schemas.microsoft.com/office/word/2018/wordml" xmlns:w16du="http://schemas.microsoft.com/office/word/2023/wordml/word16du" xmlns:w16sdtdh="http://schemas.microsoft.com/office/word/2020/wordml/sdtdatahash" xmlns:w16se="http://schemas.microsoft.com/office/word/2015/wordml/symex" xmlns:wpg="http://schemas.microsoft.com/office/word/2010/wordprocessingGroup" xmlns:wpi="http://schemas.microsoft.com/office/word/2010/wordprocessingInk" xmlns:wne="http://schemas.microsoft.com/office/word/2006/wordml" xmlns:wps="http://schemas.microsoft.com/office/word/2010/wordprocessingShape" mc:Ignorable="w14 w15 w16se w16cid w16 w16cex w16sdtdh w16du wp14">
   <w:p>
     <w:pPr>
       <w:pStyle w:val="Pieddepage"/>
@@ -7267,7 +6927,6 @@
           <w:docPartUnique/>
         </w:docPartObj>
       </w:sdtPr>
-      <w:sdtEndPr/>
       <w:sdtContent>
         <w:r>
           <w:rPr>
@@ -7308,7 +6967,7 @@
 </file>
 
 <file path=word/footnotes.xml><?xml version="1.0" encoding="utf-8"?>
-<w:footnotes xmlns:wpc="http://schemas.microsoft.com/office/word/2010/wordprocessingCanvas" xmlns:cx="http://schemas.microsoft.com/office/drawing/2014/chartex" xmlns:cx1="http://schemas.microsoft.com/office/drawing/2015/9/8/chartex" xmlns:cx2="http://schemas.microsoft.com/office/drawing/2015/10/21/chartex" xmlns:cx3="http://schemas.microsoft.com/office/drawing/2016/5/9/chartex" xmlns:cx4="http://schemas.microsoft.com/office/drawing/2016/5/10/chartex" xmlns:cx5="http://schemas.microsoft.com/office/drawing/2016/5/11/chartex" xmlns:cx6="http://schemas.microsoft.com/office/drawing/2016/5/12/chartex" xmlns:cx7="http://schemas.microsoft.com/office/drawing/2016/5/13/chartex" xmlns:cx8="http://schemas.microsoft.com/office/drawing/2016/5/14/chartex" xmlns:mc="http://schemas.openxmlformats.org/markup-compatibility/2006" xmlns:aink="http://schemas.microsoft.com/office/drawing/2016/ink" xmlns:am3d="http://schemas.microsoft.com/office/drawing/2017/model3d" xmlns:o="urn:schemas-microsoft-com:office:office" xmlns:oel="http://schemas.microsoft.com/office/2019/extlst" xmlns:r="http://schemas.openxmlformats.org/officeDocument/2006/relationships" xmlns:m="http://schemas.openxmlformats.org/officeDocument/2006/math" xmlns:v="urn:schemas-microsoft-com:vml" xmlns:wp14="http://schemas.microsoft.com/office/word/2010/wordprocessingDrawing" xmlns:wp="http://schemas.openxmlformats.org/drawingml/2006/wordprocessingDrawing" xmlns:w10="urn:schemas-microsoft-com:office:word" xmlns:w="http://schemas.openxmlformats.org/wordprocessingml/2006/main" xmlns:w14="http://schemas.microsoft.com/office/word/2010/wordml" xmlns:w15="http://schemas.microsoft.com/office/word/2012/wordml" xmlns:w16cex="http://schemas.microsoft.com/office/word/2018/wordml/cex" xmlns:w16cid="http://schemas.microsoft.com/office/word/2016/wordml/cid" xmlns:w16="http://schemas.microsoft.com/office/word/2018/wordml" xmlns:w16sdtdh="http://schemas.microsoft.com/office/word/2020/wordml/sdtdatahash" xmlns:w16se="http://schemas.microsoft.com/office/word/2015/wordml/symex" xmlns:wpg="http://schemas.microsoft.com/office/word/2010/wordprocessingGroup" xmlns:wpi="http://schemas.microsoft.com/office/word/2010/wordprocessingInk" xmlns:wne="http://schemas.microsoft.com/office/word/2006/wordml" xmlns:wps="http://schemas.microsoft.com/office/word/2010/wordprocessingShape" mc:Ignorable="w14 w15 w16se w16cid w16 w16cex w16sdtdh wp14">
+<w:footnotes xmlns:wpc="http://schemas.microsoft.com/office/word/2010/wordprocessingCanvas" xmlns:cx="http://schemas.microsoft.com/office/drawing/2014/chartex" xmlns:cx1="http://schemas.microsoft.com/office/drawing/2015/9/8/chartex" xmlns:cx2="http://schemas.microsoft.com/office/drawing/2015/10/21/chartex" xmlns:cx3="http://schemas.microsoft.com/office/drawing/2016/5/9/chartex" xmlns:cx4="http://schemas.microsoft.com/office/drawing/2016/5/10/chartex" xmlns:cx5="http://schemas.microsoft.com/office/drawing/2016/5/11/chartex" xmlns:cx6="http://schemas.microsoft.com/office/drawing/2016/5/12/chartex" xmlns:cx7="http://schemas.microsoft.com/office/drawing/2016/5/13/chartex" xmlns:cx8="http://schemas.microsoft.com/office/drawing/2016/5/14/chartex" xmlns:mc="http://schemas.openxmlformats.org/markup-compatibility/2006" xmlns:aink="http://schemas.microsoft.com/office/drawing/2016/ink" xmlns:am3d="http://schemas.microsoft.com/office/drawing/2017/model3d" xmlns:o="urn:schemas-microsoft-com:office:office" xmlns:oel="http://schemas.microsoft.com/office/2019/extlst" xmlns:r="http://schemas.openxmlformats.org/officeDocument/2006/relationships" xmlns:m="http://schemas.openxmlformats.org/officeDocument/2006/math" xmlns:v="urn:schemas-microsoft-com:vml" xmlns:wp14="http://schemas.microsoft.com/office/word/2010/wordprocessingDrawing" xmlns:wp="http://schemas.openxmlformats.org/drawingml/2006/wordprocessingDrawing" xmlns:w10="urn:schemas-microsoft-com:office:word" xmlns:w="http://schemas.openxmlformats.org/wordprocessingml/2006/main" xmlns:w14="http://schemas.microsoft.com/office/word/2010/wordml" xmlns:w15="http://schemas.microsoft.com/office/word/2012/wordml" xmlns:w16cex="http://schemas.microsoft.com/office/word/2018/wordml/cex" xmlns:w16cid="http://schemas.microsoft.com/office/word/2016/wordml/cid" xmlns:w16="http://schemas.microsoft.com/office/word/2018/wordml" xmlns:w16du="http://schemas.microsoft.com/office/word/2023/wordml/word16du" xmlns:w16sdtdh="http://schemas.microsoft.com/office/word/2020/wordml/sdtdatahash" xmlns:w16se="http://schemas.microsoft.com/office/word/2015/wordml/symex" xmlns:wpg="http://schemas.microsoft.com/office/word/2010/wordprocessingGroup" xmlns:wpi="http://schemas.microsoft.com/office/word/2010/wordprocessingInk" xmlns:wne="http://schemas.microsoft.com/office/word/2006/wordml" xmlns:wps="http://schemas.microsoft.com/office/word/2010/wordprocessingShape" mc:Ignorable="w14 w15 w16se w16cid w16 w16cex w16sdtdh w16du wp14">
   <w:footnote w:type="separator" w:id="-1">
     <w:p>
       <w:r>
@@ -7331,7 +6990,7 @@
 </file>
 
 <file path=word/numbering.xml><?xml version="1.0" encoding="utf-8"?>
-<w:numbering xmlns:wpc="http://schemas.microsoft.com/office/word/2010/wordprocessingCanvas" xmlns:cx="http://schemas.microsoft.com/office/drawing/2014/chartex" xmlns:cx1="http://schemas.microsoft.com/office/drawing/2015/9/8/chartex" xmlns:cx2="http://schemas.microsoft.com/office/drawing/2015/10/21/chartex" xmlns:cx3="http://schemas.microsoft.com/office/drawing/2016/5/9/chartex" xmlns:cx4="http://schemas.microsoft.com/office/drawing/2016/5/10/chartex" xmlns:cx5="http://schemas.microsoft.com/office/drawing/2016/5/11/chartex" xmlns:cx6="http://schemas.microsoft.com/office/drawing/2016/5/12/chartex" xmlns:cx7="http://schemas.microsoft.com/office/drawing/2016/5/13/chartex" xmlns:cx8="http://schemas.microsoft.com/office/drawing/2016/5/14/chartex" xmlns:mc="http://schemas.openxmlformats.org/markup-compatibility/2006" xmlns:aink="http://schemas.microsoft.com/office/drawing/2016/ink" xmlns:am3d="http://schemas.microsoft.com/office/drawing/2017/model3d" xmlns:o="urn:schemas-microsoft-com:office:office" xmlns:oel="http://schemas.microsoft.com/office/2019/extlst" xmlns:r="http://schemas.openxmlformats.org/officeDocument/2006/relationships" xmlns:m="http://schemas.openxmlformats.org/officeDocument/2006/math" xmlns:v="urn:schemas-microsoft-com:vml" xmlns:wp14="http://schemas.microsoft.com/office/word/2010/wordprocessingDrawing" xmlns:wp="http://schemas.openxmlformats.org/drawingml/2006/wordprocessingDrawing" xmlns:w10="urn:schemas-microsoft-com:office:word" xmlns:w="http://schemas.openxmlformats.org/wordprocessingml/2006/main" xmlns:w14="http://schemas.microsoft.com/office/word/2010/wordml" xmlns:w15="http://schemas.microsoft.com/office/word/2012/wordml" xmlns:w16cex="http://schemas.microsoft.com/office/word/2018/wordml/cex" xmlns:w16cid="http://schemas.microsoft.com/office/word/2016/wordml/cid" xmlns:w16="http://schemas.microsoft.com/office/word/2018/wordml" xmlns:w16sdtdh="http://schemas.microsoft.com/office/word/2020/wordml/sdtdatahash" xmlns:w16se="http://schemas.microsoft.com/office/word/2015/wordml/symex" xmlns:wpg="http://schemas.microsoft.com/office/word/2010/wordprocessingGroup" xmlns:wpi="http://schemas.microsoft.com/office/word/2010/wordprocessingInk" xmlns:wne="http://schemas.microsoft.com/office/word/2006/wordml" xmlns:wps="http://schemas.microsoft.com/office/word/2010/wordprocessingShape" mc:Ignorable="w14 w15 w16se w16cid w16 w16cex w16sdtdh wp14">
+<w:numbering xmlns:wpc="http://schemas.microsoft.com/office/word/2010/wordprocessingCanvas" xmlns:cx="http://schemas.microsoft.com/office/drawing/2014/chartex" xmlns:cx1="http://schemas.microsoft.com/office/drawing/2015/9/8/chartex" xmlns:cx2="http://schemas.microsoft.com/office/drawing/2015/10/21/chartex" xmlns:cx3="http://schemas.microsoft.com/office/drawing/2016/5/9/chartex" xmlns:cx4="http://schemas.microsoft.com/office/drawing/2016/5/10/chartex" xmlns:cx5="http://schemas.microsoft.com/office/drawing/2016/5/11/chartex" xmlns:cx6="http://schemas.microsoft.com/office/drawing/2016/5/12/chartex" xmlns:cx7="http://schemas.microsoft.com/office/drawing/2016/5/13/chartex" xmlns:cx8="http://schemas.microsoft.com/office/drawing/2016/5/14/chartex" xmlns:mc="http://schemas.openxmlformats.org/markup-compatibility/2006" xmlns:aink="http://schemas.microsoft.com/office/drawing/2016/ink" xmlns:am3d="http://schemas.microsoft.com/office/drawing/2017/model3d" xmlns:o="urn:schemas-microsoft-com:office:office" xmlns:oel="http://schemas.microsoft.com/office/2019/extlst" xmlns:r="http://schemas.openxmlformats.org/officeDocument/2006/relationships" xmlns:m="http://schemas.openxmlformats.org/officeDocument/2006/math" xmlns:v="urn:schemas-microsoft-com:vml" xmlns:wp14="http://schemas.microsoft.com/office/word/2010/wordprocessingDrawing" xmlns:wp="http://schemas.openxmlformats.org/drawingml/2006/wordprocessingDrawing" xmlns:w10="urn:schemas-microsoft-com:office:word" xmlns:w="http://schemas.openxmlformats.org/wordprocessingml/2006/main" xmlns:w14="http://schemas.microsoft.com/office/word/2010/wordml" xmlns:w15="http://schemas.microsoft.com/office/word/2012/wordml" xmlns:w16cex="http://schemas.microsoft.com/office/word/2018/wordml/cex" xmlns:w16cid="http://schemas.microsoft.com/office/word/2016/wordml/cid" xmlns:w16="http://schemas.microsoft.com/office/word/2018/wordml" xmlns:w16du="http://schemas.microsoft.com/office/word/2023/wordml/word16du" xmlns:w16sdtdh="http://schemas.microsoft.com/office/word/2020/wordml/sdtdatahash" xmlns:w16se="http://schemas.microsoft.com/office/word/2015/wordml/symex" xmlns:wpg="http://schemas.microsoft.com/office/word/2010/wordprocessingGroup" xmlns:wpi="http://schemas.microsoft.com/office/word/2010/wordprocessingInk" xmlns:wne="http://schemas.microsoft.com/office/word/2006/wordml" xmlns:wps="http://schemas.microsoft.com/office/word/2010/wordprocessingShape" mc:Ignorable="w14 w15 w16se w16cid w16 w16cex w16sdtdh w16du wp14">
   <w:abstractNum w:abstractNumId="0" w15:restartNumberingAfterBreak="0">
     <w:nsid w:val="3C6B0E7A"/>
     <w:multiLevelType w:val="hybridMultilevel"/>
@@ -7949,7 +7608,7 @@
 </file>
 
 <file path=word/styles.xml><?xml version="1.0" encoding="utf-8"?>
-<w:styles xmlns:mc="http://schemas.openxmlformats.org/markup-compatibility/2006" xmlns:r="http://schemas.openxmlformats.org/officeDocument/2006/relationships" xmlns:w="http://schemas.openxmlformats.org/wordprocessingml/2006/main" xmlns:w14="http://schemas.microsoft.com/office/word/2010/wordml" xmlns:w15="http://schemas.microsoft.com/office/word/2012/wordml" xmlns:w16cex="http://schemas.microsoft.com/office/word/2018/wordml/cex" xmlns:w16cid="http://schemas.microsoft.com/office/word/2016/wordml/cid" xmlns:w16="http://schemas.microsoft.com/office/word/2018/wordml" xmlns:w16sdtdh="http://schemas.microsoft.com/office/word/2020/wordml/sdtdatahash" xmlns:w16se="http://schemas.microsoft.com/office/word/2015/wordml/symex" mc:Ignorable="w14 w15 w16se w16cid w16 w16cex w16sdtdh">
+<w:styles xmlns:mc="http://schemas.openxmlformats.org/markup-compatibility/2006" xmlns:r="http://schemas.openxmlformats.org/officeDocument/2006/relationships" xmlns:w="http://schemas.openxmlformats.org/wordprocessingml/2006/main" xmlns:w14="http://schemas.microsoft.com/office/word/2010/wordml" xmlns:w15="http://schemas.microsoft.com/office/word/2012/wordml" xmlns:w16cex="http://schemas.microsoft.com/office/word/2018/wordml/cex" xmlns:w16cid="http://schemas.microsoft.com/office/word/2016/wordml/cid" xmlns:w16="http://schemas.microsoft.com/office/word/2018/wordml" xmlns:w16du="http://schemas.microsoft.com/office/word/2023/wordml/word16du" xmlns:w16sdtdh="http://schemas.microsoft.com/office/word/2020/wordml/sdtdatahash" xmlns:w16se="http://schemas.microsoft.com/office/word/2015/wordml/symex" mc:Ignorable="w14 w15 w16se w16cid w16 w16cex w16sdtdh w16du">
   <w:docDefaults>
     <w:rPrDefault>
       <w:rPr>
@@ -8769,6 +8428,18 @@
       <w:lang w:val="en-GB"/>
     </w:rPr>
   </w:style>
+  <w:style w:type="character" w:styleId="Mentionnonrsolue">
+    <w:name w:val="Unresolved Mention"/>
+    <w:basedOn w:val="Policepardfaut"/>
+    <w:uiPriority w:val="99"/>
+    <w:semiHidden/>
+    <w:unhideWhenUsed/>
+    <w:rsid w:val="00E86918"/>
+    <w:rPr>
+      <w:color w:val="605E5C"/>
+      <w:shd w:val="clear" w:color="auto" w:fill="E1DFDD"/>
+    </w:rPr>
+  </w:style>
 </w:styles>
 </file>
 

</xml_diff>